<commit_message>
Modification cmd + suppression yaml
</commit_message>
<xml_diff>
--- a/commandes.docx
+++ b/commandes.docx
@@ -14,6 +14,94 @@
         </w:rPr>
         <w:t xml:space="preserve">docker build -t </w:t>
       </w:r>
+      <w:proofErr w:type="gramStart"/>
+      <w:r>
+        <w:rPr>
+          <w:lang w:val="en-US"/>
+        </w:rPr>
+        <w:t>heart:v0 .</w:t>
+      </w:r>
+      <w:proofErr w:type="gramEnd"/>
+    </w:p>
+    <w:p>
+      <w:pPr>
+        <w:rPr>
+          <w:lang w:val="en-US"/>
+        </w:rPr>
+      </w:pPr>
+      <w:r>
+        <w:rPr>
+          <w:lang w:val="en-US"/>
+        </w:rPr>
+        <w:t xml:space="preserve">docker run -d -p 4444:5000 </w:t>
+      </w:r>
+      <w:proofErr w:type="gramStart"/>
+      <w:r>
+        <w:rPr>
+          <w:lang w:val="en-US"/>
+        </w:rPr>
+        <w:t>heart:v</w:t>
+      </w:r>
+      <w:proofErr w:type="gramEnd"/>
+      <w:r>
+        <w:rPr>
+          <w:lang w:val="en-US"/>
+        </w:rPr>
+        <w:t>0</w:t>
+      </w:r>
+    </w:p>
+    <w:p>
+      <w:pPr>
+        <w:rPr>
+          <w:lang w:val="en-US"/>
+        </w:rPr>
+      </w:pPr>
+      <w:r>
+        <w:rPr>
+          <w:lang w:val="en-US"/>
+        </w:rPr>
+        <w:t xml:space="preserve">docker run -d -p 4444:5000 -v "C:\Users\dolph\Documents\Master\M1\Programmation </w:t>
+      </w:r>
+      <w:proofErr w:type="spellStart"/>
+      <w:r>
+        <w:rPr>
+          <w:lang w:val="en-US"/>
+        </w:rPr>
+        <w:t>distribuée</w:t>
+      </w:r>
+      <w:proofErr w:type="spellEnd"/>
+      <w:r>
+        <w:rPr>
+          <w:lang w:val="en-US"/>
+        </w:rPr>
+        <w:t>\</w:t>
+      </w:r>
+      <w:proofErr w:type="spellStart"/>
+      <w:r>
+        <w:rPr>
+          <w:lang w:val="en-US"/>
+        </w:rPr>
+        <w:t>projet</w:t>
+      </w:r>
+      <w:proofErr w:type="spellEnd"/>
+      <w:r>
+        <w:rPr>
+          <w:lang w:val="en-US"/>
+        </w:rPr>
+        <w:t>\heart</w:t>
+      </w:r>
+      <w:r>
+        <w:rPr>
+          <w:lang w:val="en-US"/>
+        </w:rPr>
+        <w:t>\heart.py</w:t>
+      </w:r>
+      <w:r>
+        <w:rPr>
+          <w:lang w:val="en-US"/>
+        </w:rPr>
+        <w:t>:/app/</w:t>
+      </w:r>
       <w:r>
         <w:rPr>
           <w:lang w:val="en-US"/>
@@ -24,55 +112,165 @@
         <w:rPr>
           <w:lang w:val="en-US"/>
         </w:rPr>
-        <w:t>:v0 .</w:t>
-      </w:r>
-    </w:p>
-    <w:p>
-      <w:pPr>
-        <w:rPr>
-          <w:lang w:val="en-US"/>
-        </w:rPr>
-      </w:pPr>
-      <w:r>
-        <w:rPr>
-          <w:lang w:val="en-US"/>
-        </w:rPr>
-        <w:t xml:space="preserve">docker run -d -p 4444:5000 </w:t>
-      </w:r>
-      <w:r>
-        <w:rPr>
-          <w:lang w:val="en-US"/>
+        <w:t xml:space="preserve">.py" </w:t>
+      </w:r>
+      <w:proofErr w:type="gramStart"/>
+      <w:r>
+        <w:rPr>
+          <w:lang w:val="en-US"/>
+        </w:rPr>
+        <w:t>heart:v</w:t>
+      </w:r>
+      <w:proofErr w:type="gramEnd"/>
+      <w:r>
+        <w:rPr>
+          <w:lang w:val="en-US"/>
+        </w:rPr>
+        <w:t>0</w:t>
+      </w:r>
+    </w:p>
+    <w:p>
+      <w:pPr>
+        <w:rPr>
+          <w:lang w:val="de-DE"/>
+        </w:rPr>
+      </w:pPr>
+      <w:proofErr w:type="spellStart"/>
+      <w:r>
+        <w:rPr>
+          <w:lang w:val="de-DE"/>
+        </w:rPr>
+        <w:t>docker</w:t>
+      </w:r>
+      <w:proofErr w:type="spellEnd"/>
+      <w:r>
+        <w:rPr>
+          <w:lang w:val="de-DE"/>
+        </w:rPr>
+        <w:t xml:space="preserve"> tag </w:t>
+      </w:r>
+      <w:proofErr w:type="gramStart"/>
+      <w:r>
+        <w:rPr>
+          <w:lang w:val="de-DE"/>
+        </w:rPr>
+        <w:t>heart:v</w:t>
+      </w:r>
+      <w:proofErr w:type="gramEnd"/>
+      <w:r>
+        <w:rPr>
+          <w:lang w:val="de-DE"/>
+        </w:rPr>
+        <w:t>0</w:t>
+      </w:r>
+      <w:r>
+        <w:rPr>
+          <w:lang w:val="de-DE"/>
+        </w:rPr>
+        <w:t xml:space="preserve"> </w:t>
+      </w:r>
+      <w:proofErr w:type="spellStart"/>
+      <w:r>
+        <w:rPr>
+          <w:lang w:val="de-DE"/>
+        </w:rPr>
+        <w:t>gimenezm</w:t>
+      </w:r>
+      <w:proofErr w:type="spellEnd"/>
+      <w:r>
+        <w:rPr>
+          <w:lang w:val="de-DE"/>
+        </w:rPr>
+        <w:t>/</w:t>
+      </w:r>
+      <w:proofErr w:type="gramStart"/>
+      <w:r>
+        <w:rPr>
+          <w:lang w:val="de-DE"/>
         </w:rPr>
         <w:t>heart</w:t>
       </w:r>
       <w:r>
         <w:rPr>
-          <w:lang w:val="en-US"/>
-        </w:rPr>
-        <w:t>:v0</w:t>
-      </w:r>
-    </w:p>
-    <w:p>
-      <w:pPr>
-        <w:rPr>
-          <w:lang w:val="de-DE"/>
-        </w:rPr>
-      </w:pPr>
-      <w:r>
-        <w:rPr>
-          <w:lang w:val="de-DE"/>
-        </w:rPr>
-        <w:t>docker tag 96b370765037 gimenezm/</w:t>
-      </w:r>
+          <w:lang w:val="de-DE"/>
+        </w:rPr>
+        <w:t>:v</w:t>
+      </w:r>
+      <w:proofErr w:type="gramEnd"/>
+      <w:r>
+        <w:rPr>
+          <w:lang w:val="de-DE"/>
+        </w:rPr>
+        <w:t>0</w:t>
+      </w:r>
+    </w:p>
+    <w:p>
+      <w:pPr>
+        <w:rPr>
+          <w:lang w:val="de-DE"/>
+        </w:rPr>
+      </w:pPr>
+      <w:proofErr w:type="spellStart"/>
+      <w:r>
+        <w:rPr>
+          <w:lang w:val="de-DE"/>
+        </w:rPr>
+        <w:t>docker</w:t>
+      </w:r>
+      <w:proofErr w:type="spellEnd"/>
       <w:r>
         <w:rPr>
           <w:lang w:val="de-DE"/>
         </w:rPr>
         <w:t xml:space="preserve"> </w:t>
       </w:r>
-      <w:r>
-        <w:rPr>
-          <w:lang w:val="de-DE"/>
+      <w:proofErr w:type="spellStart"/>
+      <w:r>
+        <w:rPr>
+          <w:lang w:val="de-DE"/>
+        </w:rPr>
+        <w:t>login</w:t>
+      </w:r>
+      <w:proofErr w:type="spellEnd"/>
+    </w:p>
+    <w:p>
+      <w:pPr>
+        <w:rPr>
+          <w:lang w:val="de-DE"/>
+        </w:rPr>
+      </w:pPr>
+      <w:proofErr w:type="spellStart"/>
+      <w:r>
+        <w:rPr>
+          <w:lang w:val="de-DE"/>
+        </w:rPr>
+        <w:t>docker</w:t>
+      </w:r>
+      <w:proofErr w:type="spellEnd"/>
+      <w:r>
+        <w:rPr>
+          <w:lang w:val="de-DE"/>
+        </w:rPr>
+        <w:t xml:space="preserve"> push </w:t>
+      </w:r>
+      <w:proofErr w:type="spellStart"/>
+      <w:r>
+        <w:rPr>
+          <w:lang w:val="de-DE"/>
+        </w:rPr>
+        <w:t>gimenezm</w:t>
+      </w:r>
+      <w:proofErr w:type="spellEnd"/>
+      <w:r>
+        <w:rPr>
+          <w:lang w:val="de-DE"/>
+        </w:rPr>
+        <w:t>/</w:t>
+      </w:r>
+      <w:proofErr w:type="gramStart"/>
+      <w:r>
+        <w:rPr>
+          <w:lang w:val="en-US"/>
         </w:rPr>
         <w:t>heart</w:t>
       </w:r>
@@ -80,91 +278,63 @@
         <w:rPr>
           <w:lang w:val="de-DE"/>
         </w:rPr>
-        <w:t>:v0</w:t>
-      </w:r>
-    </w:p>
-    <w:p>
-      <w:pPr>
-        <w:rPr>
-          <w:lang w:val="de-DE"/>
-        </w:rPr>
-      </w:pPr>
-      <w:r>
-        <w:rPr>
-          <w:lang w:val="de-DE"/>
-        </w:rPr>
-        <w:t>docker login</w:t>
-      </w:r>
-    </w:p>
-    <w:p>
-      <w:pPr>
-        <w:rPr>
-          <w:lang w:val="de-DE"/>
-        </w:rPr>
-      </w:pPr>
-      <w:r>
-        <w:rPr>
-          <w:lang w:val="de-DE"/>
-        </w:rPr>
-        <w:t>docker push gimenezm/</w:t>
-      </w:r>
-      <w:r>
-        <w:rPr>
-          <w:lang w:val="en-US"/>
-        </w:rPr>
-        <w:t xml:space="preserve"> </w:t>
-      </w:r>
-      <w:r>
-        <w:rPr>
-          <w:lang w:val="en-US"/>
-        </w:rPr>
-        <w:t>heart</w:t>
-      </w:r>
-      <w:r>
-        <w:rPr>
-          <w:lang w:val="de-DE"/>
-        </w:rPr>
-        <w:t>:v0</w:t>
-      </w:r>
-    </w:p>
-    <w:p>
-      <w:pPr>
-        <w:rPr>
-          <w:lang w:val="de-DE"/>
-        </w:rPr>
-      </w:pPr>
-    </w:p>
-    <w:p>
-      <w:pPr>
-        <w:rPr>
-          <w:lang w:val="de-DE"/>
-        </w:rPr>
-      </w:pPr>
-    </w:p>
-    <w:p>
-      <w:pPr>
-        <w:rPr>
-          <w:lang w:val="en-US"/>
-        </w:rPr>
-      </w:pPr>
-      <w:r>
-        <w:rPr>
-          <w:lang w:val="en-US"/>
-        </w:rPr>
-        <w:t>minikube start</w:t>
-      </w:r>
-    </w:p>
-    <w:p>
-      <w:pPr>
-        <w:rPr>
-          <w:lang w:val="en-US"/>
-        </w:rPr>
-      </w:pPr>
-      <w:r>
-        <w:rPr>
-          <w:lang w:val="en-US"/>
-        </w:rPr>
-        <w:t>kubectl get nodes</w:t>
+        <w:t>:v</w:t>
+      </w:r>
+      <w:proofErr w:type="gramEnd"/>
+      <w:r>
+        <w:rPr>
+          <w:lang w:val="de-DE"/>
+        </w:rPr>
+        <w:t>0</w:t>
+      </w:r>
+    </w:p>
+    <w:p>
+      <w:pPr>
+        <w:rPr>
+          <w:lang w:val="de-DE"/>
+        </w:rPr>
+      </w:pPr>
+    </w:p>
+    <w:p>
+      <w:pPr>
+        <w:rPr>
+          <w:lang w:val="en-US"/>
+        </w:rPr>
+      </w:pPr>
+      <w:proofErr w:type="spellStart"/>
+      <w:r>
+        <w:rPr>
+          <w:lang w:val="en-US"/>
+        </w:rPr>
+        <w:t>minikube</w:t>
+      </w:r>
+      <w:proofErr w:type="spellEnd"/>
+      <w:r>
+        <w:rPr>
+          <w:lang w:val="en-US"/>
+        </w:rPr>
+        <w:t xml:space="preserve"> start</w:t>
+      </w:r>
+    </w:p>
+    <w:p>
+      <w:pPr>
+        <w:rPr>
+          <w:lang w:val="en-US"/>
+        </w:rPr>
+      </w:pPr>
+      <w:proofErr w:type="spellStart"/>
+      <w:r>
+        <w:rPr>
+          <w:lang w:val="en-US"/>
+        </w:rPr>
+        <w:t>kubectl</w:t>
+      </w:r>
+      <w:proofErr w:type="spellEnd"/>
+      <w:r>
+        <w:rPr>
+          <w:lang w:val="en-US"/>
+        </w:rPr>
+        <w:t xml:space="preserve"> get nodes</w:t>
       </w:r>
     </w:p>
     <w:p>
@@ -179,7 +349,7 @@
           <w:lang w:val="en-US"/>
         </w:rPr>
         <w:drawing>
-          <wp:inline distT="0" distB="0" distL="0" distR="0" wp14:anchorId="4A43584D" wp14:editId="23259E82">
+          <wp:inline distT="0" distB="0" distL="0" distR="0" wp14:anchorId="0A928F38" wp14:editId="338D0739">
             <wp:extent cx="5760720" cy="490220"/>
             <wp:effectExtent l="0" t="0" r="0" b="5080"/>
             <wp:docPr id="210976954" name="Image 1"/>
@@ -228,11 +398,19 @@
           <w:lang w:val="en-US"/>
         </w:rPr>
       </w:pPr>
-      <w:r>
-        <w:rPr>
-          <w:lang w:val="en-US"/>
-        </w:rPr>
-        <w:t xml:space="preserve">kubectl create deployment </w:t>
+      <w:proofErr w:type="spellStart"/>
+      <w:r>
+        <w:rPr>
+          <w:lang w:val="en-US"/>
+        </w:rPr>
+        <w:t>kubectl</w:t>
+      </w:r>
+      <w:proofErr w:type="spellEnd"/>
+      <w:r>
+        <w:rPr>
+          <w:lang w:val="en-US"/>
+        </w:rPr>
+        <w:t xml:space="preserve"> apply -f </w:t>
       </w:r>
       <w:r>
         <w:rPr>
@@ -244,56 +422,354 @@
         <w:rPr>
           <w:lang w:val="en-US"/>
         </w:rPr>
+        <w:t>-</w:t>
+      </w:r>
+      <w:proofErr w:type="spellStart"/>
+      <w:r>
+        <w:rPr>
+          <w:lang w:val="en-US"/>
+        </w:rPr>
+        <w:t>deployment.yml</w:t>
+      </w:r>
+      <w:proofErr w:type="spellEnd"/>
+    </w:p>
+    <w:p>
+      <w:pPr>
+        <w:rPr>
+          <w:lang w:val="en-US"/>
+        </w:rPr>
+      </w:pPr>
+      <w:proofErr w:type="spellStart"/>
+      <w:r>
+        <w:rPr>
+          <w:lang w:val="en-US"/>
+        </w:rPr>
+        <w:t>kubectl</w:t>
+      </w:r>
+      <w:proofErr w:type="spellEnd"/>
+      <w:r>
+        <w:rPr>
+          <w:lang w:val="en-US"/>
+        </w:rPr>
+        <w:t xml:space="preserve"> apply -f </w:t>
+      </w:r>
+      <w:r>
+        <w:rPr>
+          <w:lang w:val="en-US"/>
+        </w:rPr>
+        <w:t>heart</w:t>
+      </w:r>
+      <w:r>
+        <w:rPr>
+          <w:lang w:val="en-US"/>
+        </w:rPr>
+        <w:t>-service</w:t>
+      </w:r>
+      <w:r>
+        <w:rPr>
+          <w:lang w:val="en-US"/>
+        </w:rPr>
+        <w:t>-</w:t>
+      </w:r>
+      <w:proofErr w:type="spellStart"/>
+      <w:r>
+        <w:rPr>
+          <w:lang w:val="en-US"/>
+        </w:rPr>
+        <w:t>nodeport</w:t>
+      </w:r>
+      <w:r>
+        <w:rPr>
+          <w:lang w:val="en-US"/>
+        </w:rPr>
+        <w:t>.yml</w:t>
+      </w:r>
+      <w:proofErr w:type="spellEnd"/>
+    </w:p>
+    <w:p>
+      <w:pPr>
+        <w:rPr>
+          <w:lang w:val="en-US"/>
+        </w:rPr>
+      </w:pPr>
+    </w:p>
+    <w:p>
+      <w:pPr>
+        <w:rPr>
+          <w:lang w:val="en-US"/>
+        </w:rPr>
+      </w:pPr>
+    </w:p>
+    <w:p>
+      <w:proofErr w:type="gramStart"/>
+      <w:r>
+        <w:t>docker</w:t>
+      </w:r>
+      <w:proofErr w:type="gramEnd"/>
+      <w:r>
         <w:t xml:space="preserve"> </w:t>
       </w:r>
-      <w:r>
-        <w:rPr>
-          <w:lang w:val="en-US"/>
-        </w:rPr>
-        <w:t>--image=gimenezm/</w:t>
-      </w:r>
-      <w:r>
-        <w:rPr>
-          <w:lang w:val="en-US"/>
+      <w:proofErr w:type="spellStart"/>
+      <w:r>
+        <w:t>build</w:t>
+      </w:r>
+      <w:proofErr w:type="spellEnd"/>
+      <w:r>
+        <w:t xml:space="preserve"> -t titre:v0 .</w:t>
+      </w:r>
+    </w:p>
+    <w:p>
+      <w:proofErr w:type="gramStart"/>
+      <w:r>
+        <w:t>docker</w:t>
+      </w:r>
+      <w:proofErr w:type="gramEnd"/>
+      <w:r>
+        <w:t xml:space="preserve"> run -d -p 4445:5001 </w:t>
+      </w:r>
+      <w:proofErr w:type="gramStart"/>
+      <w:r>
+        <w:t>titre</w:t>
+      </w:r>
+      <w:proofErr w:type="gramEnd"/>
+      <w:r>
+        <w:t>:v0</w:t>
+      </w:r>
+    </w:p>
+    <w:p>
+      <w:proofErr w:type="gramStart"/>
+      <w:r>
+        <w:t>docker</w:t>
+      </w:r>
+      <w:proofErr w:type="gramEnd"/>
+      <w:r>
+        <w:t xml:space="preserve"> run -d -p 4445:5001 -v "C:\Users\dolph\Documents\Master\M1\Programmation distribuée\projet\titre\titre.py:/app/titre.py" titre:v0</w:t>
+      </w:r>
+    </w:p>
+    <w:p>
+      <w:pPr>
+        <w:rPr>
+          <w:lang w:val="de-DE"/>
+        </w:rPr>
+      </w:pPr>
+      <w:proofErr w:type="spellStart"/>
+      <w:r>
+        <w:rPr>
+          <w:lang w:val="de-DE"/>
+        </w:rPr>
+        <w:t>docker</w:t>
+      </w:r>
+      <w:proofErr w:type="spellEnd"/>
+      <w:r>
+        <w:rPr>
+          <w:lang w:val="de-DE"/>
+        </w:rPr>
+        <w:t xml:space="preserve"> tag </w:t>
+      </w:r>
+      <w:proofErr w:type="gramStart"/>
+      <w:r>
+        <w:rPr>
+          <w:lang w:val="de-DE"/>
+        </w:rPr>
+        <w:t>titre:v</w:t>
+      </w:r>
+      <w:proofErr w:type="gramEnd"/>
+      <w:r>
+        <w:rPr>
+          <w:lang w:val="de-DE"/>
+        </w:rPr>
+        <w:t>0</w:t>
+      </w:r>
+      <w:r>
+        <w:rPr>
+          <w:lang w:val="de-DE"/>
         </w:rPr>
         <w:t xml:space="preserve"> </w:t>
       </w:r>
-      <w:r>
-        <w:rPr>
-          <w:lang w:val="en-US"/>
-        </w:rPr>
-        <w:t>heart</w:t>
-      </w:r>
-      <w:r>
-        <w:rPr>
-          <w:lang w:val="en-US"/>
-        </w:rPr>
-        <w:t>:v0</w:t>
-      </w:r>
-    </w:p>
-    <w:p>
-      <w:pPr>
-        <w:rPr>
-          <w:lang w:val="en-US"/>
-        </w:rPr>
-      </w:pPr>
-      <w:r>
-        <w:rPr>
-          <w:lang w:val="en-US"/>
-        </w:rPr>
-        <w:t>kubectl get pods</w:t>
-      </w:r>
-    </w:p>
-    <w:p>
+      <w:proofErr w:type="spellStart"/>
+      <w:r>
+        <w:rPr>
+          <w:lang w:val="de-DE"/>
+        </w:rPr>
+        <w:t>gimenezm</w:t>
+      </w:r>
+      <w:proofErr w:type="spellEnd"/>
+      <w:r>
+        <w:rPr>
+          <w:lang w:val="de-DE"/>
+        </w:rPr>
+        <w:t>/</w:t>
+      </w:r>
+      <w:proofErr w:type="gramStart"/>
+      <w:r>
+        <w:rPr>
+          <w:lang w:val="de-DE"/>
+        </w:rPr>
+        <w:t>titre</w:t>
+      </w:r>
+      <w:r>
+        <w:rPr>
+          <w:lang w:val="de-DE"/>
+        </w:rPr>
+        <w:t>:v</w:t>
+      </w:r>
+      <w:proofErr w:type="gramEnd"/>
+      <w:r>
+        <w:rPr>
+          <w:lang w:val="de-DE"/>
+        </w:rPr>
+        <w:t>0</w:t>
+      </w:r>
+    </w:p>
+    <w:p>
+      <w:pPr>
+        <w:rPr>
+          <w:lang w:val="de-DE"/>
+        </w:rPr>
+      </w:pPr>
+      <w:proofErr w:type="spellStart"/>
+      <w:r>
+        <w:rPr>
+          <w:lang w:val="de-DE"/>
+        </w:rPr>
+        <w:t>docker</w:t>
+      </w:r>
+      <w:proofErr w:type="spellEnd"/>
+      <w:r>
+        <w:rPr>
+          <w:lang w:val="de-DE"/>
+        </w:rPr>
+        <w:t xml:space="preserve"> </w:t>
+      </w:r>
+      <w:proofErr w:type="spellStart"/>
+      <w:r>
+        <w:rPr>
+          <w:lang w:val="de-DE"/>
+        </w:rPr>
+        <w:t>login</w:t>
+      </w:r>
+      <w:proofErr w:type="spellEnd"/>
+    </w:p>
+    <w:p>
+      <w:pPr>
+        <w:rPr>
+          <w:lang w:val="de-DE"/>
+        </w:rPr>
+      </w:pPr>
+      <w:proofErr w:type="spellStart"/>
+      <w:r>
+        <w:rPr>
+          <w:lang w:val="de-DE"/>
+        </w:rPr>
+        <w:t>docker</w:t>
+      </w:r>
+      <w:proofErr w:type="spellEnd"/>
+      <w:r>
+        <w:rPr>
+          <w:lang w:val="de-DE"/>
+        </w:rPr>
+        <w:t xml:space="preserve"> push </w:t>
+      </w:r>
+      <w:proofErr w:type="spellStart"/>
+      <w:r>
+        <w:rPr>
+          <w:lang w:val="de-DE"/>
+        </w:rPr>
+        <w:t>gimenezm</w:t>
+      </w:r>
+      <w:proofErr w:type="spellEnd"/>
+      <w:r>
+        <w:rPr>
+          <w:lang w:val="de-DE"/>
+        </w:rPr>
+        <w:t>/</w:t>
+      </w:r>
+      <w:proofErr w:type="gramStart"/>
+      <w:r>
+        <w:rPr>
+          <w:lang w:val="de-DE"/>
+        </w:rPr>
+        <w:t>titre</w:t>
+      </w:r>
+      <w:r>
+        <w:rPr>
+          <w:lang w:val="de-DE"/>
+        </w:rPr>
+        <w:t>:v</w:t>
+      </w:r>
+      <w:proofErr w:type="gramEnd"/>
+      <w:r>
+        <w:rPr>
+          <w:lang w:val="de-DE"/>
+        </w:rPr>
+        <w:t>0</w:t>
+      </w:r>
+    </w:p>
+    <w:p>
+      <w:pPr>
+        <w:rPr>
+          <w:lang w:val="de-DE"/>
+        </w:rPr>
+      </w:pPr>
+    </w:p>
+    <w:p>
+      <w:pPr>
+        <w:rPr>
+          <w:lang w:val="en-US"/>
+        </w:rPr>
+      </w:pPr>
+      <w:proofErr w:type="spellStart"/>
+      <w:r>
+        <w:rPr>
+          <w:lang w:val="en-US"/>
+        </w:rPr>
+        <w:t>minikube</w:t>
+      </w:r>
+      <w:proofErr w:type="spellEnd"/>
+      <w:r>
+        <w:rPr>
+          <w:lang w:val="en-US"/>
+        </w:rPr>
+        <w:t xml:space="preserve"> start</w:t>
+      </w:r>
+    </w:p>
+    <w:p>
+      <w:pPr>
+        <w:rPr>
+          <w:lang w:val="en-US"/>
+        </w:rPr>
+      </w:pPr>
+      <w:proofErr w:type="spellStart"/>
+      <w:r>
+        <w:rPr>
+          <w:lang w:val="en-US"/>
+        </w:rPr>
+        <w:t>kubectl</w:t>
+      </w:r>
+      <w:proofErr w:type="spellEnd"/>
+      <w:r>
+        <w:rPr>
+          <w:lang w:val="en-US"/>
+        </w:rPr>
+        <w:t xml:space="preserve"> get nodes</w:t>
+      </w:r>
+    </w:p>
+    <w:p>
+      <w:pPr>
+        <w:rPr>
+          <w:lang w:val="en-US"/>
+        </w:rPr>
+      </w:pPr>
       <w:r>
         <w:rPr>
           <w:noProof/>
+          <w:lang w:val="en-US"/>
         </w:rPr>
         <w:drawing>
-          <wp:inline distT="0" distB="0" distL="0" distR="0" wp14:anchorId="0A4961F4" wp14:editId="2D59DEA1">
-            <wp:extent cx="5760720" cy="454660"/>
-            <wp:effectExtent l="0" t="0" r="0" b="2540"/>
-            <wp:docPr id="914521150" name="Image 1"/>
+          <wp:inline distT="0" distB="0" distL="0" distR="0" wp14:anchorId="445AF22B" wp14:editId="70093B01">
+            <wp:extent cx="5760720" cy="490220"/>
+            <wp:effectExtent l="0" t="0" r="0" b="5080"/>
+            <wp:docPr id="655617181" name="Image 1"/>
             <wp:cNvGraphicFramePr>
               <a:graphicFrameLocks xmlns:a="http://schemas.openxmlformats.org/drawingml/2006/main" noChangeAspect="1"/>
             </wp:cNvGraphicFramePr>
@@ -301,11 +777,11 @@
               <a:graphicData uri="http://schemas.openxmlformats.org/drawingml/2006/picture">
                 <pic:pic xmlns:pic="http://schemas.openxmlformats.org/drawingml/2006/picture">
                   <pic:nvPicPr>
-                    <pic:cNvPr id="914521150" name=""/>
+                    <pic:cNvPr id="210976954" name=""/>
                     <pic:cNvPicPr/>
                   </pic:nvPicPr>
                   <pic:blipFill>
-                    <a:blip r:embed="rId5"/>
+                    <a:blip r:embed="rId4"/>
                     <a:stretch>
                       <a:fillRect/>
                     </a:stretch>
@@ -313,7 +789,7 @@
                   <pic:spPr>
                     <a:xfrm>
                       <a:off x="0" y="0"/>
-                      <a:ext cx="5760720" cy="454660"/>
+                      <a:ext cx="5760720" cy="490220"/>
                     </a:xfrm>
                     <a:prstGeom prst="rect">
                       <a:avLst/>
@@ -332,276 +808,368 @@
           <w:lang w:val="en-US"/>
         </w:rPr>
       </w:pPr>
-      <w:r>
-        <w:rPr>
-          <w:lang w:val="en-US"/>
-        </w:rPr>
-        <w:t xml:space="preserve">kubectl expose deployment </w:t>
-      </w:r>
-      <w:r>
-        <w:rPr>
-          <w:lang w:val="en-US"/>
-        </w:rPr>
-        <w:t>heart</w:t>
-      </w:r>
-      <w:r>
-        <w:rPr>
-          <w:lang w:val="en-US"/>
+    </w:p>
+    <w:p>
+      <w:pPr>
+        <w:rPr>
+          <w:lang w:val="en-US"/>
+        </w:rPr>
+      </w:pPr>
+      <w:proofErr w:type="spellStart"/>
+      <w:r>
+        <w:rPr>
+          <w:lang w:val="en-US"/>
+        </w:rPr>
+        <w:t>kubectl</w:t>
+      </w:r>
+      <w:proofErr w:type="spellEnd"/>
+      <w:r>
+        <w:rPr>
+          <w:lang w:val="en-US"/>
+        </w:rPr>
+        <w:t xml:space="preserve"> apply -f </w:t>
+      </w:r>
+      <w:proofErr w:type="spellStart"/>
+      <w:r>
+        <w:rPr>
+          <w:lang w:val="en-US"/>
+        </w:rPr>
+        <w:t>titre</w:t>
+      </w:r>
+      <w:r>
+        <w:rPr>
+          <w:lang w:val="en-US"/>
+        </w:rPr>
+        <w:t>-deployment.yml</w:t>
+      </w:r>
+      <w:proofErr w:type="spellEnd"/>
+    </w:p>
+    <w:p>
+      <w:pPr>
+        <w:rPr>
+          <w:lang w:val="en-US"/>
+        </w:rPr>
+      </w:pPr>
+      <w:proofErr w:type="spellStart"/>
+      <w:r>
+        <w:rPr>
+          <w:lang w:val="en-US"/>
+        </w:rPr>
+        <w:t>kubectl</w:t>
+      </w:r>
+      <w:proofErr w:type="spellEnd"/>
+      <w:r>
+        <w:rPr>
+          <w:lang w:val="en-US"/>
+        </w:rPr>
+        <w:t xml:space="preserve"> apply -f </w:t>
+      </w:r>
+      <w:proofErr w:type="spellStart"/>
+      <w:r>
+        <w:rPr>
+          <w:lang w:val="en-US"/>
+        </w:rPr>
+        <w:t>titre</w:t>
+      </w:r>
+      <w:proofErr w:type="spellEnd"/>
+      <w:r>
+        <w:rPr>
+          <w:lang w:val="en-US"/>
+        </w:rPr>
+        <w:t>-service</w:t>
+      </w:r>
+      <w:r>
+        <w:rPr>
+          <w:lang w:val="en-US"/>
+        </w:rPr>
+        <w:t>-</w:t>
+      </w:r>
+      <w:proofErr w:type="spellStart"/>
+      <w:r>
+        <w:rPr>
+          <w:lang w:val="en-US"/>
+        </w:rPr>
+        <w:t>nodeport</w:t>
+      </w:r>
+      <w:r>
+        <w:rPr>
+          <w:lang w:val="en-US"/>
+        </w:rPr>
+        <w:t>.yml</w:t>
+      </w:r>
+      <w:proofErr w:type="spellEnd"/>
+    </w:p>
+    <w:p>
+      <w:pPr>
+        <w:rPr>
+          <w:lang w:val="en-US"/>
+        </w:rPr>
+      </w:pPr>
+    </w:p>
+    <w:p>
+      <w:pPr>
+        <w:rPr>
+          <w:lang w:val="en-US"/>
+        </w:rPr>
+      </w:pPr>
+    </w:p>
+    <w:p>
+      <w:pPr>
+        <w:rPr>
+          <w:lang w:val="en-US"/>
+        </w:rPr>
+      </w:pPr>
+      <w:proofErr w:type="spellStart"/>
+      <w:r>
+        <w:rPr>
+          <w:lang w:val="en-US"/>
+        </w:rPr>
+        <w:t>minikube</w:t>
+      </w:r>
+      <w:proofErr w:type="spellEnd"/>
+      <w:r>
+        <w:rPr>
+          <w:lang w:val="en-US"/>
+        </w:rPr>
+        <w:t xml:space="preserve"> addons enable ingress</w:t>
+      </w:r>
+    </w:p>
+    <w:p>
+      <w:pPr>
+        <w:rPr>
+          <w:lang w:val="en-US"/>
+        </w:rPr>
+      </w:pPr>
+      <w:proofErr w:type="spellStart"/>
+      <w:r>
+        <w:rPr>
+          <w:lang w:val="en-US"/>
+        </w:rPr>
+        <w:t>kubectl</w:t>
+      </w:r>
+      <w:proofErr w:type="spellEnd"/>
+      <w:r>
+        <w:rPr>
+          <w:lang w:val="en-US"/>
+        </w:rPr>
+        <w:t xml:space="preserve"> get pods -n ingress-nginx</w:t>
+      </w:r>
+    </w:p>
+    <w:p>
+      <w:pPr>
+        <w:rPr>
+          <w:lang w:val="en-US"/>
+        </w:rPr>
+      </w:pPr>
+      <w:proofErr w:type="spellStart"/>
+      <w:r>
+        <w:rPr>
+          <w:lang w:val="en-US"/>
+        </w:rPr>
+        <w:t>kubectl</w:t>
+      </w:r>
+      <w:proofErr w:type="spellEnd"/>
+      <w:r>
+        <w:rPr>
+          <w:lang w:val="en-US"/>
+        </w:rPr>
+        <w:t xml:space="preserve"> apply -f </w:t>
+      </w:r>
+      <w:proofErr w:type="spellStart"/>
+      <w:r>
+        <w:rPr>
+          <w:lang w:val="en-US"/>
+        </w:rPr>
+        <w:t>ingress.yml</w:t>
+      </w:r>
+      <w:proofErr w:type="spellEnd"/>
+    </w:p>
+    <w:p>
+      <w:pPr>
+        <w:rPr>
+          <w:lang w:val="en-US"/>
+        </w:rPr>
+      </w:pPr>
+      <w:proofErr w:type="spellStart"/>
+      <w:r>
+        <w:rPr>
+          <w:lang w:val="en-US"/>
+        </w:rPr>
+        <w:t>kubectl</w:t>
+      </w:r>
+      <w:proofErr w:type="spellEnd"/>
+      <w:r>
+        <w:rPr>
+          <w:lang w:val="en-US"/>
+        </w:rPr>
+        <w:t xml:space="preserve"> get ingress</w:t>
+      </w:r>
+    </w:p>
+    <w:p>
+      <w:pPr>
+        <w:rPr>
+          <w:lang w:val="en-US"/>
+        </w:rPr>
+      </w:pPr>
+    </w:p>
+    <w:p>
+      <w:pPr>
+        <w:rPr>
+          <w:lang w:val="en-US"/>
+        </w:rPr>
+      </w:pPr>
+      <w:r>
+        <w:rPr>
+          <w:lang w:val="en-US"/>
+        </w:rPr>
+        <w:t xml:space="preserve">On </w:t>
+      </w:r>
+      <w:proofErr w:type="gramStart"/>
+      <w:r>
+        <w:rPr>
+          <w:lang w:val="en-US"/>
+        </w:rPr>
+        <w:t>Windows :</w:t>
+      </w:r>
+      <w:proofErr w:type="gramEnd"/>
+      <w:r>
+        <w:rPr>
+          <w:lang w:val="en-US"/>
+        </w:rPr>
+        <w:t xml:space="preserve"> edit the c:\windows\system32\drivers\etc\hosts file, add</w:t>
+      </w:r>
+    </w:p>
+    <w:p>
+      <w:pPr>
+        <w:rPr>
+          <w:lang w:val="en-US"/>
+        </w:rPr>
+      </w:pPr>
+      <w:r>
+        <w:rPr>
+          <w:lang w:val="en-US"/>
+        </w:rPr>
+        <w:t xml:space="preserve">127.0.0.1 </w:t>
+      </w:r>
+      <w:r>
+        <w:rPr>
+          <w:lang w:val="en-US"/>
+        </w:rPr>
+        <w:t>prog-dist</w:t>
+      </w:r>
+      <w:r>
+        <w:rPr>
+          <w:lang w:val="en-US"/>
+        </w:rPr>
+        <w:t>.info</w:t>
+      </w:r>
+    </w:p>
+    <w:p>
+      <w:pPr>
+        <w:rPr>
+          <w:lang w:val="en-US"/>
+        </w:rPr>
+      </w:pPr>
+    </w:p>
+    <w:p>
+      <w:pPr>
+        <w:rPr>
+          <w:lang w:val="en-US"/>
+        </w:rPr>
+      </w:pPr>
+      <w:proofErr w:type="spellStart"/>
+      <w:r>
+        <w:rPr>
+          <w:lang w:val="en-US"/>
+        </w:rPr>
+        <w:t>minikube</w:t>
+      </w:r>
+      <w:proofErr w:type="spellEnd"/>
+      <w:r>
+        <w:rPr>
+          <w:lang w:val="en-US"/>
+        </w:rPr>
+        <w:t xml:space="preserve"> addons enable ingress-</w:t>
+      </w:r>
+      <w:proofErr w:type="spellStart"/>
+      <w:r>
+        <w:rPr>
+          <w:lang w:val="en-US"/>
+        </w:rPr>
+        <w:t>dns</w:t>
+      </w:r>
+      <w:proofErr w:type="spellEnd"/>
+    </w:p>
+    <w:p>
+      <w:pPr>
+        <w:rPr>
+          <w:lang w:val="de-DE"/>
+        </w:rPr>
+      </w:pPr>
+      <w:proofErr w:type="spellStart"/>
+      <w:r>
+        <w:rPr>
+          <w:lang w:val="de-DE"/>
+        </w:rPr>
+        <w:t>minikube</w:t>
+      </w:r>
+      <w:proofErr w:type="spellEnd"/>
+      <w:r>
+        <w:rPr>
+          <w:lang w:val="de-DE"/>
         </w:rPr>
         <w:t xml:space="preserve"> </w:t>
       </w:r>
-      <w:r>
-        <w:rPr>
-          <w:lang w:val="en-US"/>
-        </w:rPr>
-        <w:t>--type=NodePort --port=5000</w:t>
-      </w:r>
-    </w:p>
-    <w:p>
-      <w:pPr>
-        <w:rPr>
-          <w:lang w:val="en-US"/>
-        </w:rPr>
-      </w:pPr>
-      <w:r>
-        <w:rPr>
-          <w:lang w:val="en-US"/>
-        </w:rPr>
-        <w:t xml:space="preserve">minikube service </w:t>
-      </w:r>
-      <w:r>
-        <w:rPr>
-          <w:lang w:val="en-US"/>
-        </w:rPr>
-        <w:t xml:space="preserve">heart </w:t>
-      </w:r>
-      <w:r>
-        <w:rPr>
-          <w:lang w:val="en-US"/>
-        </w:rPr>
-        <w:t>–</w:t>
-      </w:r>
-      <w:r>
-        <w:rPr>
-          <w:lang w:val="en-US"/>
-        </w:rPr>
-        <w:t>url</w:t>
-      </w:r>
-    </w:p>
-    <w:p>
-      <w:pPr>
-        <w:rPr>
-          <w:lang w:val="en-US"/>
-        </w:rPr>
-      </w:pPr>
-    </w:p>
-    <w:p>
-      <w:pPr>
-        <w:rPr>
-          <w:lang w:val="en-US"/>
-        </w:rPr>
-      </w:pPr>
-      <w:r>
-        <w:rPr>
-          <w:lang w:val="en-US"/>
-        </w:rPr>
-        <w:t xml:space="preserve">kubectl apply -f </w:t>
-      </w:r>
-      <w:r>
-        <w:rPr>
-          <w:lang w:val="en-US"/>
-        </w:rPr>
-        <w:t xml:space="preserve">heart </w:t>
-      </w:r>
-      <w:r>
-        <w:rPr>
-          <w:lang w:val="en-US"/>
-        </w:rPr>
-        <w:t>-deployment.yml</w:t>
-      </w:r>
-    </w:p>
-    <w:p>
-      <w:pPr>
-        <w:rPr>
-          <w:lang w:val="en-US"/>
-        </w:rPr>
-      </w:pPr>
-      <w:r>
-        <w:rPr>
-          <w:lang w:val="en-US"/>
-        </w:rPr>
-        <w:t xml:space="preserve">kubectl apply -f </w:t>
-      </w:r>
-      <w:r>
-        <w:rPr>
-          <w:lang w:val="en-US"/>
-        </w:rPr>
-        <w:t xml:space="preserve">heart </w:t>
-      </w:r>
-      <w:r>
-        <w:rPr>
-          <w:lang w:val="en-US"/>
-        </w:rPr>
-        <w:t>-service.yml</w:t>
-      </w:r>
-    </w:p>
-    <w:p>
-      <w:pPr>
-        <w:rPr>
-          <w:lang w:val="en-US"/>
-        </w:rPr>
-      </w:pPr>
-    </w:p>
-    <w:p>
-      <w:pPr>
-        <w:rPr>
-          <w:lang w:val="en-US"/>
-        </w:rPr>
-      </w:pPr>
-    </w:p>
-    <w:p>
-      <w:pPr>
-        <w:rPr>
-          <w:lang w:val="en-US"/>
-        </w:rPr>
-      </w:pPr>
-      <w:r>
-        <w:rPr>
-          <w:lang w:val="en-US"/>
-        </w:rPr>
-        <w:t>minikube addons enable ingress</w:t>
-      </w:r>
-    </w:p>
-    <w:p>
-      <w:pPr>
-        <w:rPr>
-          <w:lang w:val="en-US"/>
-        </w:rPr>
-      </w:pPr>
-      <w:r>
-        <w:rPr>
-          <w:lang w:val="en-US"/>
-        </w:rPr>
-        <w:t>kubectl get pods -n ingress-nginx</w:t>
-      </w:r>
-    </w:p>
-    <w:p>
-      <w:pPr>
-        <w:rPr>
-          <w:lang w:val="en-US"/>
-        </w:rPr>
-      </w:pPr>
-      <w:r>
-        <w:rPr>
-          <w:lang w:val="en-US"/>
-        </w:rPr>
-        <w:t>kubectl apply -f ingress.yml</w:t>
-      </w:r>
-    </w:p>
-    <w:p>
-      <w:pPr>
-        <w:rPr>
-          <w:lang w:val="en-US"/>
-        </w:rPr>
-      </w:pPr>
-      <w:r>
-        <w:rPr>
-          <w:lang w:val="en-US"/>
-        </w:rPr>
-        <w:t>kubectl get ingress</w:t>
-      </w:r>
-    </w:p>
-    <w:p>
-      <w:pPr>
-        <w:rPr>
-          <w:lang w:val="en-US"/>
-        </w:rPr>
-      </w:pPr>
-    </w:p>
-    <w:p>
-      <w:pPr>
-        <w:rPr>
-          <w:lang w:val="en-US"/>
-        </w:rPr>
-      </w:pPr>
-      <w:r>
-        <w:rPr>
-          <w:lang w:val="en-US"/>
-        </w:rPr>
-        <w:t>On Windows : edit the c:\windows\system32\drivers\etc\hosts file, add</w:t>
-      </w:r>
-    </w:p>
-    <w:p>
-      <w:pPr>
-        <w:rPr>
-          <w:lang w:val="en-US"/>
-        </w:rPr>
-      </w:pPr>
-      <w:r>
-        <w:rPr>
-          <w:lang w:val="en-US"/>
-        </w:rPr>
-        <w:t xml:space="preserve">127.0.0.1 </w:t>
-      </w:r>
-      <w:r>
-        <w:rPr>
-          <w:lang w:val="en-US"/>
-        </w:rPr>
-        <w:t>prog-dist</w:t>
-      </w:r>
-      <w:r>
-        <w:rPr>
-          <w:lang w:val="en-US"/>
-        </w:rPr>
-        <w:t>.info</w:t>
-      </w:r>
-    </w:p>
-    <w:p>
-      <w:pPr>
-        <w:rPr>
-          <w:lang w:val="en-US"/>
-        </w:rPr>
-      </w:pPr>
-    </w:p>
-    <w:p>
-      <w:pPr>
-        <w:rPr>
-          <w:lang w:val="en-US"/>
-        </w:rPr>
-      </w:pPr>
-      <w:r>
-        <w:rPr>
-          <w:lang w:val="en-US"/>
-        </w:rPr>
-        <w:t>minikube addons enable ingress-dns</w:t>
-      </w:r>
-    </w:p>
-    <w:p>
-      <w:pPr>
-        <w:rPr>
-          <w:lang w:val="de-DE"/>
-        </w:rPr>
-      </w:pPr>
-      <w:r>
-        <w:rPr>
-          <w:lang w:val="de-DE"/>
-        </w:rPr>
-        <w:t>minikube tunnel</w:t>
-      </w:r>
-    </w:p>
-    <w:p>
-      <w:pPr>
-        <w:rPr>
-          <w:lang w:val="de-DE"/>
-        </w:rPr>
-      </w:pPr>
-      <w:hyperlink r:id="rId6" w:history="1">
+      <w:proofErr w:type="spellStart"/>
+      <w:r>
+        <w:rPr>
+          <w:lang w:val="de-DE"/>
+        </w:rPr>
+        <w:t>tunnel</w:t>
+      </w:r>
+      <w:proofErr w:type="spellEnd"/>
+    </w:p>
+    <w:p>
+      <w:pPr>
+        <w:rPr>
+          <w:lang w:val="de-DE"/>
+        </w:rPr>
+      </w:pPr>
+      <w:hyperlink r:id="rId5" w:history="1">
         <w:r>
           <w:rPr>
             <w:rStyle w:val="Lienhypertexte"/>
             <w:lang w:val="de-DE"/>
           </w:rPr>
-          <w:t>http://prog-dist.info</w:t>
+          <w:t>http://pro</w:t>
+        </w:r>
+        <w:r>
+          <w:rPr>
+            <w:rStyle w:val="Lienhypertexte"/>
+            <w:lang w:val="de-DE"/>
+          </w:rPr>
+          <w:t>g</w:t>
+        </w:r>
+        <w:r>
+          <w:rPr>
+            <w:rStyle w:val="Lienhypertexte"/>
+            <w:lang w:val="de-DE"/>
+          </w:rPr>
+          <w:t>-di</w:t>
+        </w:r>
+        <w:r>
+          <w:rPr>
+            <w:rStyle w:val="Lienhypertexte"/>
+            <w:lang w:val="de-DE"/>
+          </w:rPr>
+          <w:t>s</w:t>
+        </w:r>
+        <w:r>
+          <w:rPr>
+            <w:rStyle w:val="Lienhypertexte"/>
+            <w:lang w:val="de-DE"/>
+          </w:rPr>
+          <w:t>t.info</w:t>
         </w:r>
       </w:hyperlink>
     </w:p>
@@ -1029,6 +1597,7 @@
   <w:style w:type="paragraph" w:default="1" w:styleId="Normal">
     <w:name w:val="Normal"/>
     <w:qFormat/>
+    <w:rsid w:val="00520984"/>
   </w:style>
   <w:style w:type="paragraph" w:styleId="Titre1">
     <w:name w:val="heading 1"/>
@@ -1566,6 +2135,18 @@
     <w:rPr>
       <w:color w:val="605E5C"/>
       <w:shd w:val="clear" w:color="auto" w:fill="E1DFDD"/>
+    </w:rPr>
+  </w:style>
+  <w:style w:type="character" w:styleId="Lienhypertextesuivivisit">
+    <w:name w:val="FollowedHyperlink"/>
+    <w:basedOn w:val="Policepardfaut"/>
+    <w:uiPriority w:val="99"/>
+    <w:semiHidden/>
+    <w:unhideWhenUsed/>
+    <w:rsid w:val="00520984"/>
+    <w:rPr>
+      <w:color w:val="96607D" w:themeColor="followedHyperlink"/>
+      <w:u w:val="single"/>
     </w:rPr>
   </w:style>
 </w:styles>

</xml_diff>

<commit_message>
Correction de tous les bugs
</commit_message>
<xml_diff>
--- a/commandes.docx
+++ b/commandes.docx
@@ -50,6 +50,53 @@
           <w:lang w:val="en-US"/>
         </w:rPr>
         <w:t>:v0</w:t>
+      </w:r>
+    </w:p>
+    <w:p>
+      <w:pPr>
+        <w:rPr>
+          <w:lang w:val="en-US"/>
+        </w:rPr>
+      </w:pPr>
+      <w:r>
+        <w:rPr>
+          <w:lang w:val="en-US"/>
+        </w:rPr>
+        <w:drawing>
+          <wp:inline distT="0" distB="0" distL="0" distR="0" wp14:anchorId="27F500CA" wp14:editId="4133DBA4">
+            <wp:extent cx="5760720" cy="2869565"/>
+            <wp:effectExtent l="0" t="0" r="0" b="6985"/>
+            <wp:docPr id="1955746623" name="Image 1"/>
+            <wp:cNvGraphicFramePr>
+              <a:graphicFrameLocks xmlns:a="http://schemas.openxmlformats.org/drawingml/2006/main" noChangeAspect="1"/>
+            </wp:cNvGraphicFramePr>
+            <a:graphic xmlns:a="http://schemas.openxmlformats.org/drawingml/2006/main">
+              <a:graphicData uri="http://schemas.openxmlformats.org/drawingml/2006/picture">
+                <pic:pic xmlns:pic="http://schemas.openxmlformats.org/drawingml/2006/picture">
+                  <pic:nvPicPr>
+                    <pic:cNvPr id="1955746623" name=""/>
+                    <pic:cNvPicPr/>
+                  </pic:nvPicPr>
+                  <pic:blipFill>
+                    <a:blip r:embed="rId4"/>
+                    <a:stretch>
+                      <a:fillRect/>
+                    </a:stretch>
+                  </pic:blipFill>
+                  <pic:spPr>
+                    <a:xfrm>
+                      <a:off x="0" y="0"/>
+                      <a:ext cx="5760720" cy="2869565"/>
+                    </a:xfrm>
+                    <a:prstGeom prst="rect">
+                      <a:avLst/>
+                    </a:prstGeom>
+                  </pic:spPr>
+                </pic:pic>
+              </a:graphicData>
+            </a:graphic>
+          </wp:inline>
+        </w:drawing>
       </w:r>
     </w:p>
     <w:p>
@@ -187,7 +234,7 @@
                     <pic:cNvPicPr/>
                   </pic:nvPicPr>
                   <pic:blipFill>
-                    <a:blip r:embed="rId4"/>
+                    <a:blip r:embed="rId5"/>
                     <a:stretch>
                       <a:fillRect/>
                     </a:stretch>
@@ -298,61 +345,125 @@
       </w:pPr>
     </w:p>
     <w:p>
-      <w:r>
+      <w:pPr>
+        <w:rPr>
+          <w:lang w:val="en-US"/>
+        </w:rPr>
+      </w:pPr>
+      <w:r>
+        <w:rPr>
+          <w:lang w:val="en-US"/>
+        </w:rPr>
         <w:t>docker build -t titre:v0 .</w:t>
       </w:r>
     </w:p>
     <w:p>
-      <w:r>
-        <w:t>docker run -d -p 4445:5001 titre:v0</w:t>
-      </w:r>
-    </w:p>
-    <w:p>
-      <w:pPr>
-        <w:rPr>
-          <w:lang w:val="de-DE"/>
-        </w:rPr>
-      </w:pPr>
-      <w:r>
-        <w:rPr>
-          <w:lang w:val="de-DE"/>
+      <w:pPr>
+        <w:rPr>
+          <w:lang w:val="en-US"/>
+        </w:rPr>
+      </w:pPr>
+      <w:r>
+        <w:rPr>
+          <w:lang w:val="en-US"/>
+        </w:rPr>
+        <w:t>docker run -d -p 4445:500</w:t>
+      </w:r>
+      <w:r>
+        <w:rPr>
+          <w:lang w:val="en-US"/>
+        </w:rPr>
+        <w:t>0</w:t>
+      </w:r>
+      <w:r>
+        <w:rPr>
+          <w:lang w:val="en-US"/>
+        </w:rPr>
+        <w:t xml:space="preserve"> titre:v0</w:t>
+      </w:r>
+    </w:p>
+    <w:p>
+      <w:pPr>
+        <w:rPr>
+          <w:lang w:val="en-US"/>
+        </w:rPr>
+      </w:pPr>
+      <w:r>
+        <w:rPr>
+          <w:lang w:val="en-US"/>
+        </w:rPr>
+        <w:lastRenderedPageBreak/>
+        <w:drawing>
+          <wp:inline distT="0" distB="0" distL="0" distR="0" wp14:anchorId="60F8C4BA" wp14:editId="59E1F2B5">
+            <wp:extent cx="5760720" cy="2869565"/>
+            <wp:effectExtent l="0" t="0" r="0" b="6985"/>
+            <wp:docPr id="537266666" name="Image 1"/>
+            <wp:cNvGraphicFramePr>
+              <a:graphicFrameLocks xmlns:a="http://schemas.openxmlformats.org/drawingml/2006/main" noChangeAspect="1"/>
+            </wp:cNvGraphicFramePr>
+            <a:graphic xmlns:a="http://schemas.openxmlformats.org/drawingml/2006/main">
+              <a:graphicData uri="http://schemas.openxmlformats.org/drawingml/2006/picture">
+                <pic:pic xmlns:pic="http://schemas.openxmlformats.org/drawingml/2006/picture">
+                  <pic:nvPicPr>
+                    <pic:cNvPr id="537266666" name=""/>
+                    <pic:cNvPicPr/>
+                  </pic:nvPicPr>
+                  <pic:blipFill>
+                    <a:blip r:embed="rId6"/>
+                    <a:stretch>
+                      <a:fillRect/>
+                    </a:stretch>
+                  </pic:blipFill>
+                  <pic:spPr>
+                    <a:xfrm>
+                      <a:off x="0" y="0"/>
+                      <a:ext cx="5760720" cy="2869565"/>
+                    </a:xfrm>
+                    <a:prstGeom prst="rect">
+                      <a:avLst/>
+                    </a:prstGeom>
+                  </pic:spPr>
+                </pic:pic>
+              </a:graphicData>
+            </a:graphic>
+          </wp:inline>
+        </w:drawing>
+      </w:r>
+    </w:p>
+    <w:p>
+      <w:pPr>
+        <w:rPr>
+          <w:lang w:val="en-US"/>
+        </w:rPr>
+      </w:pPr>
+      <w:r>
+        <w:rPr>
+          <w:lang w:val="en-US"/>
         </w:rPr>
         <w:t xml:space="preserve">docker tag </w:t>
       </w:r>
       <w:r>
         <w:rPr>
-          <w:lang w:val="de-DE"/>
+          <w:lang w:val="en-US"/>
         </w:rPr>
         <w:t>titre:v0</w:t>
       </w:r>
       <w:r>
         <w:rPr>
-          <w:lang w:val="de-DE"/>
-        </w:rPr>
-        <w:t xml:space="preserve"> gimenezm/</w:t>
-      </w:r>
-      <w:r>
-        <w:rPr>
-          <w:lang w:val="de-DE"/>
-        </w:rPr>
-        <w:t>titre</w:t>
-      </w:r>
-      <w:r>
-        <w:rPr>
-          <w:lang w:val="de-DE"/>
-        </w:rPr>
-        <w:t>:v0</w:t>
-      </w:r>
-    </w:p>
-    <w:p>
-      <w:pPr>
-        <w:rPr>
-          <w:lang w:val="de-DE"/>
-        </w:rPr>
-      </w:pPr>
-      <w:r>
-        <w:rPr>
-          <w:lang w:val="de-DE"/>
+          <w:lang w:val="en-US"/>
+        </w:rPr>
+        <w:t xml:space="preserve"> gimenezm/titre:v0</w:t>
+      </w:r>
+    </w:p>
+    <w:p>
+      <w:pPr>
+        <w:rPr>
+          <w:lang w:val="en-US"/>
+        </w:rPr>
+      </w:pPr>
+      <w:r>
+        <w:rPr>
+          <w:lang w:val="en-US"/>
         </w:rPr>
         <w:t>docker login</w:t>
       </w:r>
@@ -360,32 +471,20 @@
     <w:p>
       <w:pPr>
         <w:rPr>
-          <w:lang w:val="de-DE"/>
-        </w:rPr>
-      </w:pPr>
-      <w:r>
-        <w:rPr>
-          <w:lang w:val="de-DE"/>
-        </w:rPr>
-        <w:t>docker push gimenezm/</w:t>
-      </w:r>
-      <w:r>
-        <w:rPr>
-          <w:lang w:val="de-DE"/>
-        </w:rPr>
-        <w:t>titre</w:t>
-      </w:r>
-      <w:r>
-        <w:rPr>
-          <w:lang w:val="de-DE"/>
-        </w:rPr>
-        <w:t>:v0</w:t>
-      </w:r>
-    </w:p>
-    <w:p>
-      <w:pPr>
-        <w:rPr>
-          <w:lang w:val="de-DE"/>
+          <w:lang w:val="en-US"/>
+        </w:rPr>
+      </w:pPr>
+      <w:r>
+        <w:rPr>
+          <w:lang w:val="en-US"/>
+        </w:rPr>
+        <w:t>docker push gimenezm/titre:v0</w:t>
+      </w:r>
+    </w:p>
+    <w:p>
+      <w:pPr>
+        <w:rPr>
+          <w:lang w:val="en-US"/>
         </w:rPr>
       </w:pPr>
     </w:p>
@@ -442,7 +541,7 @@
                     <pic:cNvPicPr/>
                   </pic:nvPicPr>
                   <pic:blipFill>
-                    <a:blip r:embed="rId4"/>
+                    <a:blip r:embed="rId5"/>
                     <a:stretch>
                       <a:fillRect/>
                     </a:stretch>
@@ -688,27 +787,13 @@
           <w:lang w:val="de-DE"/>
         </w:rPr>
       </w:pPr>
-      <w:hyperlink r:id="rId5" w:history="1">
+      <w:hyperlink r:id="rId7" w:history="1">
         <w:r>
           <w:rPr>
             <w:rStyle w:val="Lienhypertexte"/>
             <w:lang w:val="de-DE"/>
           </w:rPr>
-          <w:t>http://prog-d</w:t>
-        </w:r>
-        <w:r>
-          <w:rPr>
-            <w:rStyle w:val="Lienhypertexte"/>
-            <w:lang w:val="de-DE"/>
-          </w:rPr>
-          <w:t>i</w:t>
-        </w:r>
-        <w:r>
-          <w:rPr>
-            <w:rStyle w:val="Lienhypertexte"/>
-            <w:lang w:val="de-DE"/>
-          </w:rPr>
-          <w:t>st.info</w:t>
+          <w:t>http://prog-dist.info</w:t>
         </w:r>
       </w:hyperlink>
     </w:p>
@@ -727,15 +812,14 @@
       </w:pPr>
       <w:r>
         <w:rPr>
-          <w:noProof/>
           <w:lang w:val="de-DE"/>
         </w:rPr>
         <w:lastRenderedPageBreak/>
         <w:drawing>
-          <wp:inline distT="0" distB="0" distL="0" distR="0" wp14:anchorId="1376C340" wp14:editId="4332E662">
+          <wp:inline distT="0" distB="0" distL="0" distR="0" wp14:anchorId="7CD58DF6" wp14:editId="0A60FE34">
             <wp:extent cx="5760720" cy="2865755"/>
             <wp:effectExtent l="0" t="0" r="0" b="0"/>
-            <wp:docPr id="436524086" name="Image 1"/>
+            <wp:docPr id="1995883741" name="Image 1"/>
             <wp:cNvGraphicFramePr>
               <a:graphicFrameLocks xmlns:a="http://schemas.openxmlformats.org/drawingml/2006/main" noChangeAspect="1"/>
             </wp:cNvGraphicFramePr>
@@ -743,384 +827,7 @@
               <a:graphicData uri="http://schemas.openxmlformats.org/drawingml/2006/picture">
                 <pic:pic xmlns:pic="http://schemas.openxmlformats.org/drawingml/2006/picture">
                   <pic:nvPicPr>
-                    <pic:cNvPr id="436524086" name=""/>
-                    <pic:cNvPicPr/>
-                  </pic:nvPicPr>
-                  <pic:blipFill>
-                    <a:blip r:embed="rId6"/>
-                    <a:stretch>
-                      <a:fillRect/>
-                    </a:stretch>
-                  </pic:blipFill>
-                  <pic:spPr>
-                    <a:xfrm>
-                      <a:off x="0" y="0"/>
-                      <a:ext cx="5760720" cy="2865755"/>
-                    </a:xfrm>
-                    <a:prstGeom prst="rect">
-                      <a:avLst/>
-                    </a:prstGeom>
-                  </pic:spPr>
-                </pic:pic>
-              </a:graphicData>
-            </a:graphic>
-          </wp:inline>
-        </w:drawing>
-      </w:r>
-    </w:p>
-    <w:p>
-      <w:pPr>
-        <w:rPr>
-          <w:lang w:val="de-DE"/>
-        </w:rPr>
-      </w:pPr>
-    </w:p>
-    <w:p>
-      <w:pPr>
-        <w:rPr>
-          <w:lang w:val="de-DE"/>
-        </w:rPr>
-      </w:pPr>
-      <w:r>
-        <w:rPr>
-          <w:lang w:val="de-DE"/>
-        </w:rPr>
-        <w:drawing>
-          <wp:inline distT="0" distB="0" distL="0" distR="0" wp14:anchorId="4CAFDB00" wp14:editId="641F5AD6">
-            <wp:extent cx="5760720" cy="2865755"/>
-            <wp:effectExtent l="0" t="0" r="0" b="0"/>
-            <wp:docPr id="1154859272" name="Image 1"/>
-            <wp:cNvGraphicFramePr>
-              <a:graphicFrameLocks xmlns:a="http://schemas.openxmlformats.org/drawingml/2006/main" noChangeAspect="1"/>
-            </wp:cNvGraphicFramePr>
-            <a:graphic xmlns:a="http://schemas.openxmlformats.org/drawingml/2006/main">
-              <a:graphicData uri="http://schemas.openxmlformats.org/drawingml/2006/picture">
-                <pic:pic xmlns:pic="http://schemas.openxmlformats.org/drawingml/2006/picture">
-                  <pic:nvPicPr>
-                    <pic:cNvPr id="1154859272" name=""/>
-                    <pic:cNvPicPr/>
-                  </pic:nvPicPr>
-                  <pic:blipFill>
-                    <a:blip r:embed="rId7"/>
-                    <a:stretch>
-                      <a:fillRect/>
-                    </a:stretch>
-                  </pic:blipFill>
-                  <pic:spPr>
-                    <a:xfrm>
-                      <a:off x="0" y="0"/>
-                      <a:ext cx="5760720" cy="2865755"/>
-                    </a:xfrm>
-                    <a:prstGeom prst="rect">
-                      <a:avLst/>
-                    </a:prstGeom>
-                  </pic:spPr>
-                </pic:pic>
-              </a:graphicData>
-            </a:graphic>
-          </wp:inline>
-        </w:drawing>
-      </w:r>
-    </w:p>
-    <w:p>
-      <w:pPr>
-        <w:rPr>
-          <w:lang w:val="de-DE"/>
-        </w:rPr>
-      </w:pPr>
-    </w:p>
-    <w:p>
-      <w:pPr>
-        <w:rPr>
-          <w:i/>
-          <w:iCs/>
-        </w:rPr>
-      </w:pPr>
-      <w:r>
-        <w:rPr>
-          <w:i/>
-          <w:iCs/>
-        </w:rPr>
-        <w:t>pour MySQL, reprendre les yaml e</w:t>
-      </w:r>
-      <w:r>
-        <w:rPr>
-          <w:i/>
-          <w:iCs/>
-        </w:rPr>
-        <w:t>t modifier le mdp (trouver mdp de base), vérification ensuite du fonctionnement avec requête</w:t>
-      </w:r>
-    </w:p>
-    <w:p>
-      <w:pPr>
-        <w:rPr>
-          <w:i/>
-          <w:iCs/>
-          <w:lang w:val="en-US"/>
-        </w:rPr>
-      </w:pPr>
-      <w:r>
-        <w:rPr>
-          <w:i/>
-          <w:iCs/>
-          <w:lang w:val="en-US"/>
-        </w:rPr>
-        <w:t xml:space="preserve">ensuite MYSQL </w:t>
-      </w:r>
-      <w:r>
-        <w:rPr>
-          <w:i/>
-          <w:iCs/>
-        </w:rPr>
-        <w:sym w:font="Wingdings" w:char="F0E0"/>
-      </w:r>
-      <w:r>
-        <w:rPr>
-          <w:i/>
-          <w:iCs/>
-          <w:lang w:val="en-US"/>
-        </w:rPr>
-        <w:t xml:space="preserve"> CLAIM </w:t>
-      </w:r>
-      <w:r>
-        <w:rPr>
-          <w:i/>
-          <w:iCs/>
-        </w:rPr>
-        <w:sym w:font="Wingdings" w:char="F0E0"/>
-      </w:r>
-      <w:r>
-        <w:rPr>
-          <w:i/>
-          <w:iCs/>
-          <w:lang w:val="en-US"/>
-        </w:rPr>
-        <w:t xml:space="preserve"> VOLUME </w:t>
-      </w:r>
-      <w:r>
-        <w:rPr>
-          <w:i/>
-          <w:iCs/>
-        </w:rPr>
-        <w:sym w:font="Wingdings" w:char="F0E0"/>
-      </w:r>
-      <w:r>
-        <w:rPr>
-          <w:i/>
-          <w:iCs/>
-          <w:lang w:val="en-US"/>
-        </w:rPr>
-        <w:t xml:space="preserve"> DISK</w:t>
-      </w:r>
-    </w:p>
-    <w:p>
-      <w:pPr>
-        <w:rPr>
-          <w:lang w:val="en-US"/>
-        </w:rPr>
-      </w:pPr>
-      <w:r>
-        <w:rPr>
-          <w:lang w:val="en-US"/>
-        </w:rPr>
-        <w:t>kubectl apply -f mysql-secret.yaml</w:t>
-      </w:r>
-    </w:p>
-    <w:p>
-      <w:pPr>
-        <w:rPr>
-          <w:lang w:val="en-US"/>
-        </w:rPr>
-      </w:pPr>
-      <w:r>
-        <w:rPr>
-          <w:lang w:val="en-US"/>
-        </w:rPr>
-        <w:t>kubectl apply -f mysql-storage.yaml</w:t>
-      </w:r>
-    </w:p>
-    <w:p>
-      <w:pPr>
-        <w:rPr>
-          <w:lang w:val="en-US"/>
-        </w:rPr>
-      </w:pPr>
-      <w:r>
-        <w:rPr>
-          <w:lang w:val="en-US"/>
-        </w:rPr>
-        <w:t>kubectl apply -f mysql-deployment.yaml</w:t>
-      </w:r>
-    </w:p>
-    <w:p>
-      <w:pPr>
-        <w:rPr>
-          <w:lang w:val="en-US"/>
-        </w:rPr>
-      </w:pPr>
-      <w:r>
-        <w:rPr>
-          <w:lang w:val="en-US"/>
-        </w:rPr>
-        <w:t>kubectl apply -f mysql-serviceNodePort.yaml</w:t>
-      </w:r>
-    </w:p>
-    <w:p>
-      <w:pPr>
-        <w:rPr>
-          <w:lang w:val="en-US"/>
-        </w:rPr>
-      </w:pPr>
-    </w:p>
-    <w:p>
-      <w:pPr>
-        <w:rPr>
-          <w:lang w:val="en-US"/>
-        </w:rPr>
-      </w:pPr>
-      <w:r>
-        <w:rPr>
-          <w:lang w:val="en-US"/>
-        </w:rPr>
-        <w:t>kubectl get secrets</w:t>
-      </w:r>
-    </w:p>
-    <w:p>
-      <w:pPr>
-        <w:rPr>
-          <w:lang w:val="en-US"/>
-        </w:rPr>
-      </w:pPr>
-      <w:r>
-        <w:rPr>
-          <w:lang w:val="en-US"/>
-        </w:rPr>
-        <w:t>kubectl get PersistentVolumes</w:t>
-      </w:r>
-    </w:p>
-    <w:p>
-      <w:pPr>
-        <w:rPr>
-          <w:lang w:val="en-US"/>
-        </w:rPr>
-      </w:pPr>
-      <w:r>
-        <w:rPr>
-          <w:lang w:val="en-US"/>
-        </w:rPr>
-        <w:t>kubectl get PersistentVolumeClaims</w:t>
-      </w:r>
-    </w:p>
-    <w:p>
-      <w:pPr>
-        <w:rPr>
-          <w:lang w:val="en-US"/>
-        </w:rPr>
-      </w:pPr>
-      <w:r>
-        <w:rPr>
-          <w:lang w:val="en-US"/>
-        </w:rPr>
-        <w:t>kubectl get deployments</w:t>
-      </w:r>
-    </w:p>
-    <w:p>
-      <w:pPr>
-        <w:rPr>
-          <w:lang w:val="en-US"/>
-        </w:rPr>
-      </w:pPr>
-      <w:r>
-        <w:rPr>
-          <w:lang w:val="en-US"/>
-        </w:rPr>
-        <w:t>kubectl get services</w:t>
-      </w:r>
-    </w:p>
-    <w:p>
-      <w:pPr>
-        <w:rPr>
-          <w:lang w:val="en-US"/>
-        </w:rPr>
-      </w:pPr>
-      <w:r>
-        <w:rPr>
-          <w:lang w:val="en-US"/>
-        </w:rPr>
-        <w:t>kubectl get pods</w:t>
-      </w:r>
-    </w:p>
-    <w:p>
-      <w:pPr>
-        <w:rPr>
-          <w:lang w:val="en-US"/>
-        </w:rPr>
-      </w:pPr>
-    </w:p>
-    <w:p>
-      <w:pPr>
-        <w:rPr>
-          <w:lang w:val="en-US"/>
-        </w:rPr>
-      </w:pPr>
-      <w:r>
-        <w:rPr>
-          <w:lang w:val="en-US"/>
-        </w:rPr>
-        <w:lastRenderedPageBreak/>
-        <w:t>kubectl exec --stdin --tty mysql-8f5d78b77-5rjrz</w:t>
-      </w:r>
-      <w:r>
-        <w:rPr>
-          <w:lang w:val="en-US"/>
-        </w:rPr>
-        <w:t xml:space="preserve"> </w:t>
-      </w:r>
-      <w:r>
-        <w:rPr>
-          <w:lang w:val="en-US"/>
-        </w:rPr>
-        <w:t>-- mysql -ptest1234</w:t>
-      </w:r>
-    </w:p>
-    <w:p>
-      <w:pPr>
-        <w:rPr>
-          <w:lang w:val="en-US"/>
-        </w:rPr>
-      </w:pPr>
-    </w:p>
-    <w:p>
-      <w:pPr>
-        <w:rPr>
-          <w:lang w:val="en-US"/>
-        </w:rPr>
-      </w:pPr>
-    </w:p>
-    <w:p>
-      <w:pPr>
-        <w:rPr>
-          <w:lang w:val="en-US"/>
-        </w:rPr>
-      </w:pPr>
-      <w:r>
-        <w:rPr>
-          <w:noProof/>
-          <w:lang w:val="en-US"/>
-        </w:rPr>
-        <w:drawing>
-          <wp:inline distT="0" distB="0" distL="0" distR="0" wp14:anchorId="799D956C" wp14:editId="2B4185A7">
-            <wp:extent cx="5760720" cy="2865755"/>
-            <wp:effectExtent l="0" t="0" r="0" b="0"/>
-            <wp:docPr id="1394057672" name="Image 1"/>
-            <wp:cNvGraphicFramePr>
-              <a:graphicFrameLocks xmlns:a="http://schemas.openxmlformats.org/drawingml/2006/main" noChangeAspect="1"/>
-            </wp:cNvGraphicFramePr>
-            <a:graphic xmlns:a="http://schemas.openxmlformats.org/drawingml/2006/main">
-              <a:graphicData uri="http://schemas.openxmlformats.org/drawingml/2006/picture">
-                <pic:pic xmlns:pic="http://schemas.openxmlformats.org/drawingml/2006/picture">
-                  <pic:nvPicPr>
-                    <pic:cNvPr id="1394057672" name=""/>
+                    <pic:cNvPr id="1995883741" name=""/>
                     <pic:cNvPicPr/>
                   </pic:nvPicPr>
                   <pic:blipFill>
@@ -1148,19 +855,18 @@
     <w:p>
       <w:pPr>
         <w:rPr>
-          <w:lang w:val="en-US"/>
-        </w:rPr>
-      </w:pPr>
-      <w:r>
-        <w:rPr>
-          <w:noProof/>
-          <w:lang w:val="en-US"/>
+          <w:lang w:val="de-DE"/>
+        </w:rPr>
+      </w:pPr>
+      <w:r>
+        <w:rPr>
+          <w:lang w:val="de-DE"/>
         </w:rPr>
         <w:drawing>
-          <wp:inline distT="0" distB="0" distL="0" distR="0" wp14:anchorId="5730A339" wp14:editId="2D5C8543">
+          <wp:inline distT="0" distB="0" distL="0" distR="0" wp14:anchorId="6913ECB9" wp14:editId="7792D51C">
             <wp:extent cx="5760720" cy="2865755"/>
             <wp:effectExtent l="0" t="0" r="0" b="0"/>
-            <wp:docPr id="1127197373" name="Image 1"/>
+            <wp:docPr id="2046246532" name="Image 1"/>
             <wp:cNvGraphicFramePr>
               <a:graphicFrameLocks xmlns:a="http://schemas.openxmlformats.org/drawingml/2006/main" noChangeAspect="1"/>
             </wp:cNvGraphicFramePr>
@@ -1168,7 +874,7 @@
               <a:graphicData uri="http://schemas.openxmlformats.org/drawingml/2006/picture">
                 <pic:pic xmlns:pic="http://schemas.openxmlformats.org/drawingml/2006/picture">
                   <pic:nvPicPr>
-                    <pic:cNvPr id="1127197373" name=""/>
+                    <pic:cNvPr id="2046246532" name=""/>
                     <pic:cNvPicPr/>
                   </pic:nvPicPr>
                   <pic:blipFill>
@@ -1196,19 +902,26 @@
     <w:p>
       <w:pPr>
         <w:rPr>
-          <w:lang w:val="en-US"/>
+          <w:lang w:val="de-DE"/>
+        </w:rPr>
+      </w:pPr>
+    </w:p>
+    <w:p>
+      <w:pPr>
+        <w:rPr>
+          <w:lang w:val="de-DE"/>
         </w:rPr>
       </w:pPr>
       <w:r>
         <w:rPr>
           <w:noProof/>
-          <w:lang w:val="en-US"/>
+          <w:lang w:val="de-DE"/>
         </w:rPr>
         <w:drawing>
-          <wp:inline distT="0" distB="0" distL="0" distR="0" wp14:anchorId="2C739DE7" wp14:editId="6A7D6BC6">
-            <wp:extent cx="2800741" cy="1428949"/>
+          <wp:inline distT="0" distB="0" distL="0" distR="0" wp14:anchorId="4CAFDB00" wp14:editId="641F5AD6">
+            <wp:extent cx="5760720" cy="2865755"/>
             <wp:effectExtent l="0" t="0" r="0" b="0"/>
-            <wp:docPr id="1460509144" name="Image 1"/>
+            <wp:docPr id="1154859272" name="Image 1"/>
             <wp:cNvGraphicFramePr>
               <a:graphicFrameLocks xmlns:a="http://schemas.openxmlformats.org/drawingml/2006/main" noChangeAspect="1"/>
             </wp:cNvGraphicFramePr>
@@ -1216,7 +929,7 @@
               <a:graphicData uri="http://schemas.openxmlformats.org/drawingml/2006/picture">
                 <pic:pic xmlns:pic="http://schemas.openxmlformats.org/drawingml/2006/picture">
                   <pic:nvPicPr>
-                    <pic:cNvPr id="1460509144" name=""/>
+                    <pic:cNvPr id="1154859272" name=""/>
                     <pic:cNvPicPr/>
                   </pic:nvPicPr>
                   <pic:blipFill>
@@ -1228,7 +941,7 @@
                   <pic:spPr>
                     <a:xfrm>
                       <a:off x="0" y="0"/>
-                      <a:ext cx="2800741" cy="1428949"/>
+                      <a:ext cx="5760720" cy="2865755"/>
                     </a:xfrm>
                     <a:prstGeom prst="rect">
                       <a:avLst/>
@@ -1240,6 +953,327 @@
           </wp:inline>
         </w:drawing>
       </w:r>
+    </w:p>
+    <w:p>
+      <w:pPr>
+        <w:rPr>
+          <w:lang w:val="de-DE"/>
+        </w:rPr>
+      </w:pPr>
+    </w:p>
+    <w:p>
+      <w:pPr>
+        <w:rPr>
+          <w:i/>
+          <w:iCs/>
+        </w:rPr>
+      </w:pPr>
+      <w:r>
+        <w:rPr>
+          <w:i/>
+          <w:iCs/>
+        </w:rPr>
+        <w:t>pour MySQL, reprendre les yaml e</w:t>
+      </w:r>
+      <w:r>
+        <w:rPr>
+          <w:i/>
+          <w:iCs/>
+        </w:rPr>
+        <w:t>t modifier le mdp (trouver mdp de base), vérification ensuite du fonctionnement avec requête</w:t>
+      </w:r>
+    </w:p>
+    <w:p>
+      <w:pPr>
+        <w:rPr>
+          <w:i/>
+          <w:iCs/>
+          <w:lang w:val="en-US"/>
+        </w:rPr>
+      </w:pPr>
+      <w:r>
+        <w:rPr>
+          <w:i/>
+          <w:iCs/>
+          <w:lang w:val="en-US"/>
+        </w:rPr>
+        <w:t xml:space="preserve">ensuite MYSQL </w:t>
+      </w:r>
+      <w:r>
+        <w:rPr>
+          <w:i/>
+          <w:iCs/>
+        </w:rPr>
+        <w:sym w:font="Wingdings" w:char="F0E0"/>
+      </w:r>
+      <w:r>
+        <w:rPr>
+          <w:i/>
+          <w:iCs/>
+          <w:lang w:val="en-US"/>
+        </w:rPr>
+        <w:t xml:space="preserve"> CLAIM </w:t>
+      </w:r>
+      <w:r>
+        <w:rPr>
+          <w:i/>
+          <w:iCs/>
+        </w:rPr>
+        <w:sym w:font="Wingdings" w:char="F0E0"/>
+      </w:r>
+      <w:r>
+        <w:rPr>
+          <w:i/>
+          <w:iCs/>
+          <w:lang w:val="en-US"/>
+        </w:rPr>
+        <w:t xml:space="preserve"> VOLUME </w:t>
+      </w:r>
+      <w:r>
+        <w:rPr>
+          <w:i/>
+          <w:iCs/>
+        </w:rPr>
+        <w:sym w:font="Wingdings" w:char="F0E0"/>
+      </w:r>
+      <w:r>
+        <w:rPr>
+          <w:i/>
+          <w:iCs/>
+          <w:lang w:val="en-US"/>
+        </w:rPr>
+        <w:t xml:space="preserve"> DISK</w:t>
+      </w:r>
+    </w:p>
+    <w:p>
+      <w:pPr>
+        <w:rPr>
+          <w:lang w:val="en-US"/>
+        </w:rPr>
+      </w:pPr>
+      <w:r>
+        <w:rPr>
+          <w:lang w:val="en-US"/>
+        </w:rPr>
+        <w:t>kubectl apply -f mysql-secret.yaml</w:t>
+      </w:r>
+    </w:p>
+    <w:p>
+      <w:pPr>
+        <w:rPr>
+          <w:lang w:val="en-US"/>
+        </w:rPr>
+      </w:pPr>
+      <w:r>
+        <w:rPr>
+          <w:lang w:val="en-US"/>
+        </w:rPr>
+        <w:t>kubectl apply -f mysql-storage.yaml</w:t>
+      </w:r>
+    </w:p>
+    <w:p>
+      <w:pPr>
+        <w:rPr>
+          <w:lang w:val="en-US"/>
+        </w:rPr>
+      </w:pPr>
+      <w:r>
+        <w:rPr>
+          <w:lang w:val="en-US"/>
+        </w:rPr>
+        <w:t>kubectl apply -f mysql-deployment.yaml</w:t>
+      </w:r>
+    </w:p>
+    <w:p>
+      <w:pPr>
+        <w:rPr>
+          <w:lang w:val="en-US"/>
+        </w:rPr>
+      </w:pPr>
+      <w:r>
+        <w:rPr>
+          <w:lang w:val="en-US"/>
+        </w:rPr>
+        <w:t>kubectl apply -f mysql-serviceNodePort.yaml</w:t>
+      </w:r>
+    </w:p>
+    <w:p>
+      <w:pPr>
+        <w:rPr>
+          <w:lang w:val="en-US"/>
+        </w:rPr>
+      </w:pPr>
+    </w:p>
+    <w:p>
+      <w:pPr>
+        <w:rPr>
+          <w:lang w:val="en-US"/>
+        </w:rPr>
+      </w:pPr>
+      <w:r>
+        <w:rPr>
+          <w:lang w:val="en-US"/>
+        </w:rPr>
+        <w:t>kubectl get secrets</w:t>
+      </w:r>
+    </w:p>
+    <w:p>
+      <w:pPr>
+        <w:rPr>
+          <w:lang w:val="en-US"/>
+        </w:rPr>
+      </w:pPr>
+      <w:r>
+        <w:rPr>
+          <w:lang w:val="en-US"/>
+        </w:rPr>
+        <w:t>kubectl get PersistentVolumes</w:t>
+      </w:r>
+    </w:p>
+    <w:p>
+      <w:pPr>
+        <w:rPr>
+          <w:lang w:val="en-US"/>
+        </w:rPr>
+      </w:pPr>
+      <w:r>
+        <w:rPr>
+          <w:lang w:val="en-US"/>
+        </w:rPr>
+        <w:t>kubectl get PersistentVolumeClaims</w:t>
+      </w:r>
+    </w:p>
+    <w:p>
+      <w:pPr>
+        <w:rPr>
+          <w:lang w:val="en-US"/>
+        </w:rPr>
+      </w:pPr>
+      <w:r>
+        <w:rPr>
+          <w:lang w:val="en-US"/>
+        </w:rPr>
+        <w:t>kubectl get deployments</w:t>
+      </w:r>
+    </w:p>
+    <w:p>
+      <w:pPr>
+        <w:rPr>
+          <w:lang w:val="en-US"/>
+        </w:rPr>
+      </w:pPr>
+      <w:r>
+        <w:rPr>
+          <w:lang w:val="en-US"/>
+        </w:rPr>
+        <w:t>kubectl get services</w:t>
+      </w:r>
+    </w:p>
+    <w:p>
+      <w:pPr>
+        <w:rPr>
+          <w:lang w:val="en-US"/>
+        </w:rPr>
+      </w:pPr>
+      <w:r>
+        <w:rPr>
+          <w:lang w:val="en-US"/>
+        </w:rPr>
+        <w:t>kubectl get pods</w:t>
+      </w:r>
+    </w:p>
+    <w:p>
+      <w:pPr>
+        <w:rPr>
+          <w:lang w:val="en-US"/>
+        </w:rPr>
+      </w:pPr>
+    </w:p>
+    <w:p>
+      <w:pPr>
+        <w:rPr>
+          <w:lang w:val="en-US"/>
+        </w:rPr>
+      </w:pPr>
+      <w:r>
+        <w:rPr>
+          <w:lang w:val="en-US"/>
+        </w:rPr>
+        <w:t>kubectl exec --stdin --tty mysql-8f5d78b77-5rjrz</w:t>
+      </w:r>
+      <w:r>
+        <w:rPr>
+          <w:lang w:val="en-US"/>
+        </w:rPr>
+        <w:t xml:space="preserve"> </w:t>
+      </w:r>
+      <w:r>
+        <w:rPr>
+          <w:lang w:val="en-US"/>
+        </w:rPr>
+        <w:t>-- mysql -ptest1234</w:t>
+      </w:r>
+    </w:p>
+    <w:p>
+      <w:pPr>
+        <w:rPr>
+          <w:lang w:val="en-US"/>
+        </w:rPr>
+      </w:pPr>
+    </w:p>
+    <w:p>
+      <w:pPr>
+        <w:rPr>
+          <w:lang w:val="en-US"/>
+        </w:rPr>
+      </w:pPr>
+      <w:r>
+        <w:rPr>
+          <w:lang w:val="en-US"/>
+        </w:rPr>
+        <w:drawing>
+          <wp:inline distT="0" distB="0" distL="0" distR="0" wp14:anchorId="0BE2F149" wp14:editId="1C4F3C63">
+            <wp:extent cx="2781688" cy="1724266"/>
+            <wp:effectExtent l="0" t="0" r="0" b="9525"/>
+            <wp:docPr id="7041934" name="Image 1"/>
+            <wp:cNvGraphicFramePr>
+              <a:graphicFrameLocks xmlns:a="http://schemas.openxmlformats.org/drawingml/2006/main" noChangeAspect="1"/>
+            </wp:cNvGraphicFramePr>
+            <a:graphic xmlns:a="http://schemas.openxmlformats.org/drawingml/2006/main">
+              <a:graphicData uri="http://schemas.openxmlformats.org/drawingml/2006/picture">
+                <pic:pic xmlns:pic="http://schemas.openxmlformats.org/drawingml/2006/picture">
+                  <pic:nvPicPr>
+                    <pic:cNvPr id="7041934" name=""/>
+                    <pic:cNvPicPr/>
+                  </pic:nvPicPr>
+                  <pic:blipFill>
+                    <a:blip r:embed="rId11"/>
+                    <a:stretch>
+                      <a:fillRect/>
+                    </a:stretch>
+                  </pic:blipFill>
+                  <pic:spPr>
+                    <a:xfrm>
+                      <a:off x="0" y="0"/>
+                      <a:ext cx="2781688" cy="1724266"/>
+                    </a:xfrm>
+                    <a:prstGeom prst="rect">
+                      <a:avLst/>
+                    </a:prstGeom>
+                  </pic:spPr>
+                </pic:pic>
+              </a:graphicData>
+            </a:graphic>
+          </wp:inline>
+        </w:drawing>
+      </w:r>
+    </w:p>
+    <w:p>
+      <w:pPr>
+        <w:rPr>
+          <w:lang w:val="en-US"/>
+        </w:rPr>
+      </w:pPr>
     </w:p>
     <w:p>
       <w:pPr>

</xml_diff>

<commit_message>
Ajout volume + sécurisation
</commit_message>
<xml_diff>
--- a/commandes.docx
+++ b/commandes.docx
@@ -14,6 +14,7 @@
         </w:rPr>
         <w:t xml:space="preserve">docker build -t </w:t>
       </w:r>
+      <w:proofErr w:type="gramStart"/>
       <w:r>
         <w:rPr>
           <w:lang w:val="en-US"/>
@@ -26,6 +27,7 @@
         </w:rPr>
         <w:t>:v0 .</w:t>
       </w:r>
+      <w:proofErr w:type="gramEnd"/>
     </w:p>
     <w:p>
       <w:pPr>
@@ -39,6 +41,7 @@
         </w:rPr>
         <w:t xml:space="preserve">docker run -d -p 4444:5000 </w:t>
       </w:r>
+      <w:proofErr w:type="gramStart"/>
       <w:r>
         <w:rPr>
           <w:lang w:val="en-US"/>
@@ -49,17 +52,25 @@
         <w:rPr>
           <w:lang w:val="en-US"/>
         </w:rPr>
-        <w:t>:v0</w:t>
-      </w:r>
-    </w:p>
-    <w:p>
-      <w:pPr>
-        <w:rPr>
-          <w:lang w:val="en-US"/>
-        </w:rPr>
-      </w:pPr>
-      <w:r>
-        <w:rPr>
+        <w:t>:v</w:t>
+      </w:r>
+      <w:proofErr w:type="gramEnd"/>
+      <w:r>
+        <w:rPr>
+          <w:lang w:val="en-US"/>
+        </w:rPr>
+        <w:t>0</w:t>
+      </w:r>
+    </w:p>
+    <w:p>
+      <w:pPr>
+        <w:rPr>
+          <w:lang w:val="en-US"/>
+        </w:rPr>
+      </w:pPr>
+      <w:r>
+        <w:rPr>
+          <w:noProof/>
           <w:lang w:val="en-US"/>
         </w:rPr>
         <w:drawing>
@@ -105,24 +116,55 @@
           <w:lang w:val="de-DE"/>
         </w:rPr>
       </w:pPr>
-      <w:r>
-        <w:rPr>
-          <w:lang w:val="de-DE"/>
-        </w:rPr>
-        <w:t xml:space="preserve">docker tag </w:t>
-      </w:r>
-      <w:r>
-        <w:rPr>
-          <w:lang w:val="de-DE"/>
-        </w:rPr>
-        <w:t>heart:v0</w:t>
-      </w:r>
-      <w:r>
-        <w:rPr>
-          <w:lang w:val="de-DE"/>
-        </w:rPr>
-        <w:t xml:space="preserve"> gimenezm/</w:t>
-      </w:r>
+      <w:proofErr w:type="spellStart"/>
+      <w:r>
+        <w:rPr>
+          <w:lang w:val="de-DE"/>
+        </w:rPr>
+        <w:t>docker</w:t>
+      </w:r>
+      <w:proofErr w:type="spellEnd"/>
+      <w:r>
+        <w:rPr>
+          <w:lang w:val="de-DE"/>
+        </w:rPr>
+        <w:t xml:space="preserve"> tag </w:t>
+      </w:r>
+      <w:proofErr w:type="gramStart"/>
+      <w:r>
+        <w:rPr>
+          <w:lang w:val="de-DE"/>
+        </w:rPr>
+        <w:t>heart:v</w:t>
+      </w:r>
+      <w:proofErr w:type="gramEnd"/>
+      <w:r>
+        <w:rPr>
+          <w:lang w:val="de-DE"/>
+        </w:rPr>
+        <w:t>0</w:t>
+      </w:r>
+      <w:r>
+        <w:rPr>
+          <w:lang w:val="de-DE"/>
+        </w:rPr>
+        <w:t xml:space="preserve"> </w:t>
+      </w:r>
+      <w:proofErr w:type="spellStart"/>
+      <w:r>
+        <w:rPr>
+          <w:lang w:val="de-DE"/>
+        </w:rPr>
+        <w:t>gimenezm</w:t>
+      </w:r>
+      <w:proofErr w:type="spellEnd"/>
+      <w:r>
+        <w:rPr>
+          <w:lang w:val="de-DE"/>
+        </w:rPr>
+        <w:t>/</w:t>
+      </w:r>
+      <w:proofErr w:type="gramStart"/>
       <w:r>
         <w:rPr>
           <w:lang w:val="de-DE"/>
@@ -133,34 +175,80 @@
         <w:rPr>
           <w:lang w:val="de-DE"/>
         </w:rPr>
-        <w:t>:v0</w:t>
-      </w:r>
-    </w:p>
-    <w:p>
-      <w:pPr>
-        <w:rPr>
-          <w:lang w:val="de-DE"/>
-        </w:rPr>
-      </w:pPr>
-      <w:r>
-        <w:rPr>
-          <w:lang w:val="de-DE"/>
-        </w:rPr>
-        <w:t>docker login</w:t>
-      </w:r>
-    </w:p>
-    <w:p>
-      <w:pPr>
-        <w:rPr>
-          <w:lang w:val="de-DE"/>
-        </w:rPr>
-      </w:pPr>
-      <w:r>
-        <w:rPr>
-          <w:lang w:val="de-DE"/>
-        </w:rPr>
-        <w:t>docker push gimenezm/</w:t>
-      </w:r>
+        <w:t>:v</w:t>
+      </w:r>
+      <w:proofErr w:type="gramEnd"/>
+      <w:r>
+        <w:rPr>
+          <w:lang w:val="de-DE"/>
+        </w:rPr>
+        <w:t>0</w:t>
+      </w:r>
+    </w:p>
+    <w:p>
+      <w:pPr>
+        <w:rPr>
+          <w:lang w:val="de-DE"/>
+        </w:rPr>
+      </w:pPr>
+      <w:proofErr w:type="spellStart"/>
+      <w:r>
+        <w:rPr>
+          <w:lang w:val="de-DE"/>
+        </w:rPr>
+        <w:t>docker</w:t>
+      </w:r>
+      <w:proofErr w:type="spellEnd"/>
+      <w:r>
+        <w:rPr>
+          <w:lang w:val="de-DE"/>
+        </w:rPr>
+        <w:t xml:space="preserve"> </w:t>
+      </w:r>
+      <w:proofErr w:type="spellStart"/>
+      <w:r>
+        <w:rPr>
+          <w:lang w:val="de-DE"/>
+        </w:rPr>
+        <w:t>login</w:t>
+      </w:r>
+      <w:proofErr w:type="spellEnd"/>
+    </w:p>
+    <w:p>
+      <w:pPr>
+        <w:rPr>
+          <w:lang w:val="de-DE"/>
+        </w:rPr>
+      </w:pPr>
+      <w:proofErr w:type="spellStart"/>
+      <w:r>
+        <w:rPr>
+          <w:lang w:val="de-DE"/>
+        </w:rPr>
+        <w:t>docker</w:t>
+      </w:r>
+      <w:proofErr w:type="spellEnd"/>
+      <w:r>
+        <w:rPr>
+          <w:lang w:val="de-DE"/>
+        </w:rPr>
+        <w:t xml:space="preserve"> push </w:t>
+      </w:r>
+      <w:proofErr w:type="spellStart"/>
+      <w:r>
+        <w:rPr>
+          <w:lang w:val="de-DE"/>
+        </w:rPr>
+        <w:t>gimenezm</w:t>
+      </w:r>
+      <w:proofErr w:type="spellEnd"/>
+      <w:r>
+        <w:rPr>
+          <w:lang w:val="de-DE"/>
+        </w:rPr>
+        <w:t>/</w:t>
+      </w:r>
+      <w:proofErr w:type="gramStart"/>
       <w:r>
         <w:rPr>
           <w:lang w:val="en-US"/>
@@ -171,40 +259,63 @@
         <w:rPr>
           <w:lang w:val="de-DE"/>
         </w:rPr>
-        <w:t>:v0</w:t>
-      </w:r>
-    </w:p>
-    <w:p>
-      <w:pPr>
-        <w:rPr>
-          <w:lang w:val="de-DE"/>
-        </w:rPr>
-      </w:pPr>
-    </w:p>
-    <w:p>
-      <w:pPr>
-        <w:rPr>
-          <w:lang w:val="en-US"/>
-        </w:rPr>
-      </w:pPr>
-      <w:r>
-        <w:rPr>
-          <w:lang w:val="en-US"/>
-        </w:rPr>
-        <w:t>minikube start</w:t>
-      </w:r>
-    </w:p>
-    <w:p>
-      <w:pPr>
-        <w:rPr>
-          <w:lang w:val="en-US"/>
-        </w:rPr>
-      </w:pPr>
-      <w:r>
-        <w:rPr>
-          <w:lang w:val="en-US"/>
-        </w:rPr>
-        <w:t>kubectl get nodes</w:t>
+        <w:t>:v</w:t>
+      </w:r>
+      <w:proofErr w:type="gramEnd"/>
+      <w:r>
+        <w:rPr>
+          <w:lang w:val="de-DE"/>
+        </w:rPr>
+        <w:t>0</w:t>
+      </w:r>
+    </w:p>
+    <w:p>
+      <w:pPr>
+        <w:rPr>
+          <w:lang w:val="de-DE"/>
+        </w:rPr>
+      </w:pPr>
+    </w:p>
+    <w:p>
+      <w:pPr>
+        <w:rPr>
+          <w:lang w:val="en-US"/>
+        </w:rPr>
+      </w:pPr>
+      <w:proofErr w:type="spellStart"/>
+      <w:r>
+        <w:rPr>
+          <w:lang w:val="en-US"/>
+        </w:rPr>
+        <w:t>minikube</w:t>
+      </w:r>
+      <w:proofErr w:type="spellEnd"/>
+      <w:r>
+        <w:rPr>
+          <w:lang w:val="en-US"/>
+        </w:rPr>
+        <w:t xml:space="preserve"> start</w:t>
+      </w:r>
+    </w:p>
+    <w:p>
+      <w:pPr>
+        <w:rPr>
+          <w:lang w:val="en-US"/>
+        </w:rPr>
+      </w:pPr>
+      <w:proofErr w:type="spellStart"/>
+      <w:r>
+        <w:rPr>
+          <w:lang w:val="en-US"/>
+        </w:rPr>
+        <w:t>kubectl</w:t>
+      </w:r>
+      <w:proofErr w:type="spellEnd"/>
+      <w:r>
+        <w:rPr>
+          <w:lang w:val="en-US"/>
+        </w:rPr>
+        <w:t xml:space="preserve"> get nodes</w:t>
       </w:r>
     </w:p>
     <w:p>
@@ -268,11 +379,19 @@
           <w:lang w:val="en-US"/>
         </w:rPr>
       </w:pPr>
-      <w:r>
-        <w:rPr>
-          <w:lang w:val="en-US"/>
-        </w:rPr>
-        <w:t xml:space="preserve">kubectl apply -f </w:t>
+      <w:proofErr w:type="spellStart"/>
+      <w:r>
+        <w:rPr>
+          <w:lang w:val="en-US"/>
+        </w:rPr>
+        <w:t>kubectl</w:t>
+      </w:r>
+      <w:proofErr w:type="spellEnd"/>
+      <w:r>
+        <w:rPr>
+          <w:lang w:val="en-US"/>
+        </w:rPr>
+        <w:t xml:space="preserve"> apply -f </w:t>
       </w:r>
       <w:r>
         <w:rPr>
@@ -284,20 +403,36 @@
         <w:rPr>
           <w:lang w:val="en-US"/>
         </w:rPr>
-        <w:t>-deployment.yml</w:t>
-      </w:r>
-    </w:p>
-    <w:p>
-      <w:pPr>
-        <w:rPr>
-          <w:lang w:val="en-US"/>
-        </w:rPr>
-      </w:pPr>
-      <w:r>
-        <w:rPr>
-          <w:lang w:val="en-US"/>
-        </w:rPr>
-        <w:t xml:space="preserve">kubectl apply -f </w:t>
+        <w:t>-</w:t>
+      </w:r>
+      <w:proofErr w:type="spellStart"/>
+      <w:r>
+        <w:rPr>
+          <w:lang w:val="en-US"/>
+        </w:rPr>
+        <w:t>deployment.yml</w:t>
+      </w:r>
+      <w:proofErr w:type="spellEnd"/>
+    </w:p>
+    <w:p>
+      <w:pPr>
+        <w:rPr>
+          <w:lang w:val="en-US"/>
+        </w:rPr>
+      </w:pPr>
+      <w:proofErr w:type="spellStart"/>
+      <w:r>
+        <w:rPr>
+          <w:lang w:val="en-US"/>
+        </w:rPr>
+        <w:t>kubectl</w:t>
+      </w:r>
+      <w:proofErr w:type="spellEnd"/>
+      <w:r>
+        <w:rPr>
+          <w:lang w:val="en-US"/>
+        </w:rPr>
+        <w:t xml:space="preserve"> apply -f </w:t>
       </w:r>
       <w:r>
         <w:rPr>
@@ -317,6 +452,7 @@
         </w:rPr>
         <w:t>-</w:t>
       </w:r>
+      <w:proofErr w:type="spellStart"/>
       <w:r>
         <w:rPr>
           <w:lang w:val="en-US"/>
@@ -329,33 +465,42 @@
         </w:rPr>
         <w:t>.yml</w:t>
       </w:r>
-    </w:p>
-    <w:p>
-      <w:pPr>
-        <w:rPr>
-          <w:lang w:val="en-US"/>
-        </w:rPr>
-      </w:pPr>
-    </w:p>
-    <w:p>
-      <w:pPr>
-        <w:rPr>
-          <w:lang w:val="en-US"/>
-        </w:rPr>
-      </w:pPr>
-    </w:p>
-    <w:p>
-      <w:pPr>
-        <w:rPr>
-          <w:lang w:val="en-US"/>
-        </w:rPr>
-      </w:pPr>
-      <w:r>
-        <w:rPr>
-          <w:lang w:val="en-US"/>
-        </w:rPr>
-        <w:t>docker build -t titre:v0 .</w:t>
-      </w:r>
+      <w:proofErr w:type="spellEnd"/>
+    </w:p>
+    <w:p>
+      <w:pPr>
+        <w:rPr>
+          <w:lang w:val="en-US"/>
+        </w:rPr>
+      </w:pPr>
+    </w:p>
+    <w:p>
+      <w:pPr>
+        <w:rPr>
+          <w:lang w:val="en-US"/>
+        </w:rPr>
+      </w:pPr>
+    </w:p>
+    <w:p>
+      <w:pPr>
+        <w:rPr>
+          <w:lang w:val="en-US"/>
+        </w:rPr>
+      </w:pPr>
+      <w:r>
+        <w:rPr>
+          <w:lang w:val="en-US"/>
+        </w:rPr>
+        <w:t xml:space="preserve">docker build -t </w:t>
+      </w:r>
+      <w:proofErr w:type="gramStart"/>
+      <w:r>
+        <w:rPr>
+          <w:lang w:val="en-US"/>
+        </w:rPr>
+        <w:t>titre:v0 .</w:t>
+      </w:r>
+      <w:proofErr w:type="gramEnd"/>
     </w:p>
     <w:p>
       <w:pPr>
@@ -379,17 +524,32 @@
         <w:rPr>
           <w:lang w:val="en-US"/>
         </w:rPr>
-        <w:t xml:space="preserve"> titre:v0</w:t>
-      </w:r>
-    </w:p>
-    <w:p>
-      <w:pPr>
-        <w:rPr>
-          <w:lang w:val="en-US"/>
-        </w:rPr>
-      </w:pPr>
-      <w:r>
-        <w:rPr>
+        <w:t xml:space="preserve"> </w:t>
+      </w:r>
+      <w:proofErr w:type="gramStart"/>
+      <w:r>
+        <w:rPr>
+          <w:lang w:val="en-US"/>
+        </w:rPr>
+        <w:t>titre:v</w:t>
+      </w:r>
+      <w:proofErr w:type="gramEnd"/>
+      <w:r>
+        <w:rPr>
+          <w:lang w:val="en-US"/>
+        </w:rPr>
+        <w:t>0</w:t>
+      </w:r>
+    </w:p>
+    <w:p>
+      <w:pPr>
+        <w:rPr>
+          <w:lang w:val="en-US"/>
+        </w:rPr>
+      </w:pPr>
+      <w:r>
+        <w:rPr>
+          <w:noProof/>
           <w:lang w:val="en-US"/>
         </w:rPr>
         <w:lastRenderedPageBreak/>
@@ -433,85 +593,205 @@
     <w:p>
       <w:pPr>
         <w:rPr>
-          <w:lang w:val="en-US"/>
-        </w:rPr>
-      </w:pPr>
-      <w:r>
-        <w:rPr>
-          <w:lang w:val="en-US"/>
-        </w:rPr>
-        <w:t xml:space="preserve">docker tag </w:t>
-      </w:r>
-      <w:r>
-        <w:rPr>
-          <w:lang w:val="en-US"/>
-        </w:rPr>
-        <w:t>titre:v0</w:t>
-      </w:r>
-      <w:r>
-        <w:rPr>
-          <w:lang w:val="en-US"/>
-        </w:rPr>
-        <w:t xml:space="preserve"> gimenezm/titre:v0</w:t>
-      </w:r>
-    </w:p>
-    <w:p>
-      <w:pPr>
-        <w:rPr>
-          <w:lang w:val="en-US"/>
-        </w:rPr>
-      </w:pPr>
-      <w:r>
-        <w:rPr>
-          <w:lang w:val="en-US"/>
-        </w:rPr>
-        <w:t>docker login</w:t>
-      </w:r>
-    </w:p>
-    <w:p>
-      <w:pPr>
-        <w:rPr>
-          <w:lang w:val="en-US"/>
-        </w:rPr>
-      </w:pPr>
-      <w:r>
-        <w:rPr>
-          <w:lang w:val="en-US"/>
-        </w:rPr>
-        <w:t>docker push gimenezm/titre:v0</w:t>
-      </w:r>
-    </w:p>
-    <w:p>
-      <w:pPr>
-        <w:rPr>
-          <w:lang w:val="en-US"/>
-        </w:rPr>
-      </w:pPr>
-    </w:p>
-    <w:p>
-      <w:pPr>
-        <w:rPr>
-          <w:lang w:val="de-DE"/>
-        </w:rPr>
-      </w:pPr>
-      <w:r>
-        <w:rPr>
-          <w:lang w:val="de-DE"/>
-        </w:rPr>
-        <w:t>minikube start</w:t>
-      </w:r>
-    </w:p>
-    <w:p>
-      <w:pPr>
-        <w:rPr>
-          <w:lang w:val="en-US"/>
-        </w:rPr>
-      </w:pPr>
-      <w:r>
-        <w:rPr>
-          <w:lang w:val="en-US"/>
-        </w:rPr>
-        <w:t>kubectl get nodes</w:t>
+          <w:lang w:val="de-DE"/>
+        </w:rPr>
+      </w:pPr>
+      <w:proofErr w:type="spellStart"/>
+      <w:r>
+        <w:rPr>
+          <w:lang w:val="de-DE"/>
+        </w:rPr>
+        <w:t>docker</w:t>
+      </w:r>
+      <w:proofErr w:type="spellEnd"/>
+      <w:r>
+        <w:rPr>
+          <w:lang w:val="de-DE"/>
+        </w:rPr>
+        <w:t xml:space="preserve"> tag </w:t>
+      </w:r>
+      <w:proofErr w:type="gramStart"/>
+      <w:r>
+        <w:rPr>
+          <w:lang w:val="de-DE"/>
+        </w:rPr>
+        <w:t>titre:v</w:t>
+      </w:r>
+      <w:proofErr w:type="gramEnd"/>
+      <w:r>
+        <w:rPr>
+          <w:lang w:val="de-DE"/>
+        </w:rPr>
+        <w:t>0</w:t>
+      </w:r>
+      <w:r>
+        <w:rPr>
+          <w:lang w:val="de-DE"/>
+        </w:rPr>
+        <w:t xml:space="preserve"> </w:t>
+      </w:r>
+      <w:proofErr w:type="spellStart"/>
+      <w:r>
+        <w:rPr>
+          <w:lang w:val="de-DE"/>
+        </w:rPr>
+        <w:t>gimenezm</w:t>
+      </w:r>
+      <w:proofErr w:type="spellEnd"/>
+      <w:r>
+        <w:rPr>
+          <w:lang w:val="de-DE"/>
+        </w:rPr>
+        <w:t>/</w:t>
+      </w:r>
+      <w:proofErr w:type="gramStart"/>
+      <w:r>
+        <w:rPr>
+          <w:lang w:val="de-DE"/>
+        </w:rPr>
+        <w:t>titre:v</w:t>
+      </w:r>
+      <w:proofErr w:type="gramEnd"/>
+      <w:r>
+        <w:rPr>
+          <w:lang w:val="de-DE"/>
+        </w:rPr>
+        <w:t>0</w:t>
+      </w:r>
+    </w:p>
+    <w:p>
+      <w:pPr>
+        <w:rPr>
+          <w:lang w:val="de-DE"/>
+        </w:rPr>
+      </w:pPr>
+      <w:proofErr w:type="spellStart"/>
+      <w:r>
+        <w:rPr>
+          <w:lang w:val="de-DE"/>
+        </w:rPr>
+        <w:t>docker</w:t>
+      </w:r>
+      <w:proofErr w:type="spellEnd"/>
+      <w:r>
+        <w:rPr>
+          <w:lang w:val="de-DE"/>
+        </w:rPr>
+        <w:t xml:space="preserve"> </w:t>
+      </w:r>
+      <w:proofErr w:type="spellStart"/>
+      <w:r>
+        <w:rPr>
+          <w:lang w:val="de-DE"/>
+        </w:rPr>
+        <w:t>login</w:t>
+      </w:r>
+      <w:proofErr w:type="spellEnd"/>
+    </w:p>
+    <w:p>
+      <w:pPr>
+        <w:rPr>
+          <w:lang w:val="de-DE"/>
+        </w:rPr>
+      </w:pPr>
+      <w:proofErr w:type="spellStart"/>
+      <w:r>
+        <w:rPr>
+          <w:lang w:val="de-DE"/>
+        </w:rPr>
+        <w:t>docker</w:t>
+      </w:r>
+      <w:proofErr w:type="spellEnd"/>
+      <w:r>
+        <w:rPr>
+          <w:lang w:val="de-DE"/>
+        </w:rPr>
+        <w:t xml:space="preserve"> push </w:t>
+      </w:r>
+      <w:proofErr w:type="spellStart"/>
+      <w:r>
+        <w:rPr>
+          <w:lang w:val="de-DE"/>
+        </w:rPr>
+        <w:t>gimenezm</w:t>
+      </w:r>
+      <w:proofErr w:type="spellEnd"/>
+      <w:r>
+        <w:rPr>
+          <w:lang w:val="de-DE"/>
+        </w:rPr>
+        <w:t>/</w:t>
+      </w:r>
+      <w:proofErr w:type="gramStart"/>
+      <w:r>
+        <w:rPr>
+          <w:lang w:val="de-DE"/>
+        </w:rPr>
+        <w:t>titre:v</w:t>
+      </w:r>
+      <w:proofErr w:type="gramEnd"/>
+      <w:r>
+        <w:rPr>
+          <w:lang w:val="de-DE"/>
+        </w:rPr>
+        <w:t>0</w:t>
+      </w:r>
+    </w:p>
+    <w:p>
+      <w:pPr>
+        <w:rPr>
+          <w:lang w:val="de-DE"/>
+        </w:rPr>
+      </w:pPr>
+    </w:p>
+    <w:p>
+      <w:pPr>
+        <w:rPr>
+          <w:lang w:val="de-DE"/>
+        </w:rPr>
+      </w:pPr>
+      <w:proofErr w:type="spellStart"/>
+      <w:r>
+        <w:rPr>
+          <w:lang w:val="de-DE"/>
+        </w:rPr>
+        <w:t>minikube</w:t>
+      </w:r>
+      <w:proofErr w:type="spellEnd"/>
+      <w:r>
+        <w:rPr>
+          <w:lang w:val="de-DE"/>
+        </w:rPr>
+        <w:t xml:space="preserve"> </w:t>
+      </w:r>
+      <w:proofErr w:type="spellStart"/>
+      <w:r>
+        <w:rPr>
+          <w:lang w:val="de-DE"/>
+        </w:rPr>
+        <w:t>start</w:t>
+      </w:r>
+      <w:proofErr w:type="spellEnd"/>
+    </w:p>
+    <w:p>
+      <w:pPr>
+        <w:rPr>
+          <w:lang w:val="en-US"/>
+        </w:rPr>
+      </w:pPr>
+      <w:proofErr w:type="spellStart"/>
+      <w:r>
+        <w:rPr>
+          <w:lang w:val="en-US"/>
+        </w:rPr>
+        <w:t>kubectl</w:t>
+      </w:r>
+      <w:proofErr w:type="spellEnd"/>
+      <w:r>
+        <w:rPr>
+          <w:lang w:val="en-US"/>
+        </w:rPr>
+        <w:t xml:space="preserve"> get nodes</w:t>
       </w:r>
     </w:p>
     <w:p>
@@ -575,12 +855,21 @@
           <w:lang w:val="en-US"/>
         </w:rPr>
       </w:pPr>
-      <w:r>
-        <w:rPr>
-          <w:lang w:val="en-US"/>
-        </w:rPr>
-        <w:t xml:space="preserve">kubectl apply -f </w:t>
-      </w:r>
+      <w:proofErr w:type="spellStart"/>
+      <w:r>
+        <w:rPr>
+          <w:lang w:val="en-US"/>
+        </w:rPr>
+        <w:t>kubectl</w:t>
+      </w:r>
+      <w:proofErr w:type="spellEnd"/>
+      <w:r>
+        <w:rPr>
+          <w:lang w:val="en-US"/>
+        </w:rPr>
+        <w:t xml:space="preserve"> apply -f </w:t>
+      </w:r>
+      <w:proofErr w:type="spellStart"/>
       <w:r>
         <w:rPr>
           <w:lang w:val="en-US"/>
@@ -593,25 +882,36 @@
         </w:rPr>
         <w:t>-deployment.yml</w:t>
       </w:r>
-    </w:p>
-    <w:p>
-      <w:pPr>
-        <w:rPr>
-          <w:lang w:val="en-US"/>
-        </w:rPr>
-      </w:pPr>
-      <w:r>
-        <w:rPr>
-          <w:lang w:val="en-US"/>
-        </w:rPr>
-        <w:t xml:space="preserve">kubectl apply -f </w:t>
-      </w:r>
+      <w:proofErr w:type="spellEnd"/>
+    </w:p>
+    <w:p>
+      <w:pPr>
+        <w:rPr>
+          <w:lang w:val="en-US"/>
+        </w:rPr>
+      </w:pPr>
+      <w:proofErr w:type="spellStart"/>
+      <w:r>
+        <w:rPr>
+          <w:lang w:val="en-US"/>
+        </w:rPr>
+        <w:t>kubectl</w:t>
+      </w:r>
+      <w:proofErr w:type="spellEnd"/>
+      <w:r>
+        <w:rPr>
+          <w:lang w:val="en-US"/>
+        </w:rPr>
+        <w:t xml:space="preserve"> apply -f </w:t>
+      </w:r>
+      <w:proofErr w:type="spellStart"/>
       <w:r>
         <w:rPr>
           <w:lang w:val="en-US"/>
         </w:rPr>
         <w:t>titre</w:t>
       </w:r>
+      <w:proofErr w:type="spellEnd"/>
       <w:r>
         <w:rPr>
           <w:lang w:val="en-US"/>
@@ -624,6 +924,7 @@
         </w:rPr>
         <w:t>-</w:t>
       </w:r>
+      <w:proofErr w:type="spellStart"/>
       <w:r>
         <w:rPr>
           <w:lang w:val="en-US"/>
@@ -636,91 +937,146 @@
         </w:rPr>
         <w:t>.yml</w:t>
       </w:r>
-    </w:p>
-    <w:p>
-      <w:pPr>
-        <w:rPr>
-          <w:lang w:val="en-US"/>
-        </w:rPr>
-      </w:pPr>
-    </w:p>
-    <w:p>
-      <w:pPr>
-        <w:rPr>
-          <w:lang w:val="en-US"/>
-        </w:rPr>
-      </w:pPr>
-    </w:p>
-    <w:p>
-      <w:pPr>
-        <w:rPr>
-          <w:lang w:val="en-US"/>
-        </w:rPr>
-      </w:pPr>
-      <w:r>
-        <w:rPr>
-          <w:lang w:val="en-US"/>
-        </w:rPr>
-        <w:t>minikube addons enable ingress</w:t>
-      </w:r>
-    </w:p>
-    <w:p>
-      <w:pPr>
-        <w:rPr>
-          <w:lang w:val="en-US"/>
-        </w:rPr>
-      </w:pPr>
-      <w:r>
-        <w:rPr>
-          <w:lang w:val="en-US"/>
-        </w:rPr>
-        <w:t>kubectl get pods -n ingress-nginx</w:t>
-      </w:r>
-    </w:p>
-    <w:p>
-      <w:pPr>
-        <w:rPr>
-          <w:lang w:val="en-US"/>
-        </w:rPr>
-      </w:pPr>
-      <w:r>
-        <w:rPr>
-          <w:lang w:val="en-US"/>
-        </w:rPr>
-        <w:t>kubectl apply -f ingress.yml</w:t>
-      </w:r>
-    </w:p>
-    <w:p>
-      <w:pPr>
-        <w:rPr>
-          <w:lang w:val="en-US"/>
-        </w:rPr>
-      </w:pPr>
-      <w:r>
-        <w:rPr>
-          <w:lang w:val="en-US"/>
-        </w:rPr>
-        <w:t>kubectl get ingress</w:t>
-      </w:r>
-    </w:p>
-    <w:p>
-      <w:pPr>
-        <w:rPr>
-          <w:lang w:val="en-US"/>
-        </w:rPr>
-      </w:pPr>
-    </w:p>
-    <w:p>
-      <w:pPr>
-        <w:rPr>
-          <w:lang w:val="en-US"/>
-        </w:rPr>
-      </w:pPr>
-      <w:r>
-        <w:rPr>
-          <w:lang w:val="en-US"/>
-        </w:rPr>
-        <w:t>On Windows : edit the c:\windows\system32\drivers\etc\hosts file, add</w:t>
+      <w:proofErr w:type="spellEnd"/>
+    </w:p>
+    <w:p>
+      <w:pPr>
+        <w:rPr>
+          <w:lang w:val="en-US"/>
+        </w:rPr>
+      </w:pPr>
+    </w:p>
+    <w:p>
+      <w:pPr>
+        <w:rPr>
+          <w:lang w:val="en-US"/>
+        </w:rPr>
+      </w:pPr>
+    </w:p>
+    <w:p>
+      <w:pPr>
+        <w:rPr>
+          <w:lang w:val="en-US"/>
+        </w:rPr>
+      </w:pPr>
+      <w:proofErr w:type="spellStart"/>
+      <w:r>
+        <w:rPr>
+          <w:lang w:val="en-US"/>
+        </w:rPr>
+        <w:t>minikube</w:t>
+      </w:r>
+      <w:proofErr w:type="spellEnd"/>
+      <w:r>
+        <w:rPr>
+          <w:lang w:val="en-US"/>
+        </w:rPr>
+        <w:t xml:space="preserve"> addons enable ingress</w:t>
+      </w:r>
+    </w:p>
+    <w:p>
+      <w:pPr>
+        <w:rPr>
+          <w:lang w:val="en-US"/>
+        </w:rPr>
+      </w:pPr>
+      <w:proofErr w:type="spellStart"/>
+      <w:r>
+        <w:rPr>
+          <w:lang w:val="en-US"/>
+        </w:rPr>
+        <w:t>kubectl</w:t>
+      </w:r>
+      <w:proofErr w:type="spellEnd"/>
+      <w:r>
+        <w:rPr>
+          <w:lang w:val="en-US"/>
+        </w:rPr>
+        <w:t xml:space="preserve"> get pods -n ingress-nginx</w:t>
+      </w:r>
+    </w:p>
+    <w:p>
+      <w:pPr>
+        <w:rPr>
+          <w:lang w:val="en-US"/>
+        </w:rPr>
+      </w:pPr>
+      <w:proofErr w:type="spellStart"/>
+      <w:r>
+        <w:rPr>
+          <w:lang w:val="en-US"/>
+        </w:rPr>
+        <w:t>kubectl</w:t>
+      </w:r>
+      <w:proofErr w:type="spellEnd"/>
+      <w:r>
+        <w:rPr>
+          <w:lang w:val="en-US"/>
+        </w:rPr>
+        <w:t xml:space="preserve"> apply -f </w:t>
+      </w:r>
+      <w:proofErr w:type="spellStart"/>
+      <w:r>
+        <w:rPr>
+          <w:lang w:val="en-US"/>
+        </w:rPr>
+        <w:t>ingress.yml</w:t>
+      </w:r>
+      <w:proofErr w:type="spellEnd"/>
+    </w:p>
+    <w:p>
+      <w:pPr>
+        <w:rPr>
+          <w:lang w:val="en-US"/>
+        </w:rPr>
+      </w:pPr>
+      <w:proofErr w:type="spellStart"/>
+      <w:r>
+        <w:rPr>
+          <w:lang w:val="en-US"/>
+        </w:rPr>
+        <w:t>kubectl</w:t>
+      </w:r>
+      <w:proofErr w:type="spellEnd"/>
+      <w:r>
+        <w:rPr>
+          <w:lang w:val="en-US"/>
+        </w:rPr>
+        <w:t xml:space="preserve"> get ingress</w:t>
+      </w:r>
+    </w:p>
+    <w:p>
+      <w:pPr>
+        <w:rPr>
+          <w:lang w:val="en-US"/>
+        </w:rPr>
+      </w:pPr>
+    </w:p>
+    <w:p>
+      <w:pPr>
+        <w:rPr>
+          <w:lang w:val="en-US"/>
+        </w:rPr>
+      </w:pPr>
+      <w:r>
+        <w:rPr>
+          <w:lang w:val="en-US"/>
+        </w:rPr>
+        <w:t xml:space="preserve">On </w:t>
+      </w:r>
+      <w:proofErr w:type="gramStart"/>
+      <w:r>
+        <w:rPr>
+          <w:lang w:val="en-US"/>
+        </w:rPr>
+        <w:t>Windows :</w:t>
+      </w:r>
+      <w:proofErr w:type="gramEnd"/>
+      <w:r>
+        <w:rPr>
+          <w:lang w:val="en-US"/>
+        </w:rPr>
+        <w:t xml:space="preserve"> edit the c:\windows\system32\drivers\etc\hosts file, add</w:t>
       </w:r>
     </w:p>
     <w:p>
@@ -761,25 +1117,57 @@
           <w:lang w:val="en-US"/>
         </w:rPr>
       </w:pPr>
-      <w:r>
-        <w:rPr>
-          <w:lang w:val="en-US"/>
-        </w:rPr>
-        <w:t>minikube addons enable ingress-dns</w:t>
-      </w:r>
-    </w:p>
-    <w:p>
-      <w:pPr>
-        <w:rPr>
-          <w:lang w:val="de-DE"/>
-        </w:rPr>
-      </w:pPr>
-      <w:r>
-        <w:rPr>
-          <w:lang w:val="de-DE"/>
-        </w:rPr>
-        <w:t>minikube tunnel</w:t>
-      </w:r>
+      <w:proofErr w:type="spellStart"/>
+      <w:r>
+        <w:rPr>
+          <w:lang w:val="en-US"/>
+        </w:rPr>
+        <w:t>minikube</w:t>
+      </w:r>
+      <w:proofErr w:type="spellEnd"/>
+      <w:r>
+        <w:rPr>
+          <w:lang w:val="en-US"/>
+        </w:rPr>
+        <w:t xml:space="preserve"> addons enable ingress-</w:t>
+      </w:r>
+      <w:proofErr w:type="spellStart"/>
+      <w:r>
+        <w:rPr>
+          <w:lang w:val="en-US"/>
+        </w:rPr>
+        <w:t>dns</w:t>
+      </w:r>
+      <w:proofErr w:type="spellEnd"/>
+    </w:p>
+    <w:p>
+      <w:pPr>
+        <w:rPr>
+          <w:lang w:val="de-DE"/>
+        </w:rPr>
+      </w:pPr>
+      <w:proofErr w:type="spellStart"/>
+      <w:r>
+        <w:rPr>
+          <w:lang w:val="de-DE"/>
+        </w:rPr>
+        <w:t>minikube</w:t>
+      </w:r>
+      <w:proofErr w:type="spellEnd"/>
+      <w:r>
+        <w:rPr>
+          <w:lang w:val="de-DE"/>
+        </w:rPr>
+        <w:t xml:space="preserve"> </w:t>
+      </w:r>
+      <w:proofErr w:type="spellStart"/>
+      <w:r>
+        <w:rPr>
+          <w:lang w:val="de-DE"/>
+        </w:rPr>
+        <w:t>tunnel</w:t>
+      </w:r>
+      <w:proofErr w:type="spellEnd"/>
     </w:p>
     <w:p>
       <w:pPr>
@@ -812,6 +1200,7 @@
       </w:pPr>
       <w:r>
         <w:rPr>
+          <w:noProof/>
           <w:lang w:val="de-DE"/>
         </w:rPr>
         <w:lastRenderedPageBreak/>
@@ -860,6 +1249,7 @@
       </w:pPr>
       <w:r>
         <w:rPr>
+          <w:noProof/>
           <w:lang w:val="de-DE"/>
         </w:rPr>
         <w:drawing>
@@ -968,80 +1358,137 @@
           <w:iCs/>
         </w:rPr>
       </w:pPr>
+      <w:proofErr w:type="gramStart"/>
       <w:r>
         <w:rPr>
           <w:i/>
           <w:iCs/>
         </w:rPr>
-        <w:t>pour MySQL, reprendre les yaml e</w:t>
-      </w:r>
+        <w:t>pour</w:t>
+      </w:r>
+      <w:proofErr w:type="gramEnd"/>
       <w:r>
         <w:rPr>
           <w:i/>
           <w:iCs/>
         </w:rPr>
-        <w:t>t modifier le mdp (trouver mdp de base), vérification ensuite du fonctionnement avec requête</w:t>
-      </w:r>
-    </w:p>
-    <w:p>
-      <w:pPr>
+        <w:t xml:space="preserve"> MySQL, reprendre les </w:t>
+      </w:r>
+      <w:proofErr w:type="spellStart"/>
+      <w:r>
         <w:rPr>
           <w:i/>
           <w:iCs/>
-          <w:lang w:val="en-US"/>
-        </w:rPr>
-      </w:pPr>
+        </w:rPr>
+        <w:t>yaml</w:t>
+      </w:r>
+      <w:proofErr w:type="spellEnd"/>
       <w:r>
         <w:rPr>
           <w:i/>
           <w:iCs/>
-          <w:lang w:val="en-US"/>
-        </w:rPr>
-        <w:t xml:space="preserve">ensuite MYSQL </w:t>
+        </w:rPr>
+        <w:t xml:space="preserve"> e</w:t>
       </w:r>
       <w:r>
         <w:rPr>
           <w:i/>
           <w:iCs/>
         </w:rPr>
-        <w:sym w:font="Wingdings" w:char="F0E0"/>
-      </w:r>
+        <w:t xml:space="preserve">t modifier le </w:t>
+      </w:r>
+      <w:proofErr w:type="spellStart"/>
       <w:r>
         <w:rPr>
           <w:i/>
           <w:iCs/>
-          <w:lang w:val="en-US"/>
-        </w:rPr>
-        <w:t xml:space="preserve"> CLAIM </w:t>
-      </w:r>
+        </w:rPr>
+        <w:t>mdp</w:t>
+      </w:r>
+      <w:proofErr w:type="spellEnd"/>
       <w:r>
         <w:rPr>
           <w:i/>
           <w:iCs/>
         </w:rPr>
-        <w:sym w:font="Wingdings" w:char="F0E0"/>
-      </w:r>
+        <w:t xml:space="preserve"> (trouver </w:t>
+      </w:r>
+      <w:proofErr w:type="spellStart"/>
       <w:r>
         <w:rPr>
           <w:i/>
           <w:iCs/>
-          <w:lang w:val="en-US"/>
-        </w:rPr>
-        <w:t xml:space="preserve"> VOLUME </w:t>
-      </w:r>
+        </w:rPr>
+        <w:t>mdp</w:t>
+      </w:r>
+      <w:proofErr w:type="spellEnd"/>
       <w:r>
         <w:rPr>
           <w:i/>
           <w:iCs/>
         </w:rPr>
-        <w:sym w:font="Wingdings" w:char="F0E0"/>
-      </w:r>
-      <w:r>
+        <w:t xml:space="preserve"> de base), vérification ensuite du fonctionnement avec requête</w:t>
+      </w:r>
+    </w:p>
+    <w:p>
+      <w:pPr>
         <w:rPr>
           <w:i/>
           <w:iCs/>
           <w:lang w:val="en-US"/>
         </w:rPr>
+      </w:pPr>
+      <w:r>
+        <w:rPr>
+          <w:i/>
+          <w:iCs/>
+          <w:lang w:val="en-US"/>
+        </w:rPr>
+        <w:t xml:space="preserve">ensuite MYSQL </w:t>
+      </w:r>
+      <w:r>
+        <w:rPr>
+          <w:i/>
+          <w:iCs/>
+        </w:rPr>
+        <w:sym w:font="Wingdings" w:char="F0E0"/>
+      </w:r>
+      <w:r>
+        <w:rPr>
+          <w:i/>
+          <w:iCs/>
+          <w:lang w:val="en-US"/>
+        </w:rPr>
+        <w:t xml:space="preserve"> CLAIM </w:t>
+      </w:r>
+      <w:r>
+        <w:rPr>
+          <w:i/>
+          <w:iCs/>
+        </w:rPr>
+        <w:sym w:font="Wingdings" w:char="F0E0"/>
+      </w:r>
+      <w:r>
+        <w:rPr>
+          <w:i/>
+          <w:iCs/>
+          <w:lang w:val="en-US"/>
+        </w:rPr>
+        <w:t xml:space="preserve"> VOLUME </w:t>
+      </w:r>
+      <w:r>
+        <w:rPr>
+          <w:i/>
+          <w:iCs/>
+        </w:rPr>
+        <w:sym w:font="Wingdings" w:char="F0E0"/>
+      </w:r>
+      <w:r>
+        <w:rPr>
+          <w:i/>
+          <w:iCs/>
+          <w:lang w:val="en-US"/>
+        </w:rPr>
         <w:t xml:space="preserve"> DISK</w:t>
       </w:r>
     </w:p>
@@ -1051,184 +1498,438 @@
           <w:lang w:val="en-US"/>
         </w:rPr>
       </w:pPr>
-      <w:r>
-        <w:rPr>
-          <w:lang w:val="en-US"/>
-        </w:rPr>
-        <w:t>kubectl apply -f mysql-secret.yaml</w:t>
-      </w:r>
-    </w:p>
-    <w:p>
-      <w:pPr>
-        <w:rPr>
-          <w:lang w:val="en-US"/>
-        </w:rPr>
-      </w:pPr>
-      <w:r>
-        <w:rPr>
-          <w:lang w:val="en-US"/>
-        </w:rPr>
-        <w:t>kubectl apply -f mysql-storage.yaml</w:t>
-      </w:r>
-    </w:p>
-    <w:p>
-      <w:pPr>
-        <w:rPr>
-          <w:lang w:val="en-US"/>
-        </w:rPr>
-      </w:pPr>
-      <w:r>
-        <w:rPr>
-          <w:lang w:val="en-US"/>
-        </w:rPr>
-        <w:t>kubectl apply -f mysql-deployment.yaml</w:t>
-      </w:r>
-    </w:p>
-    <w:p>
-      <w:pPr>
-        <w:rPr>
-          <w:lang w:val="en-US"/>
-        </w:rPr>
-      </w:pPr>
-      <w:r>
-        <w:rPr>
-          <w:lang w:val="en-US"/>
-        </w:rPr>
-        <w:t>kubectl apply -f mysql-serviceNodePort.yaml</w:t>
-      </w:r>
-    </w:p>
-    <w:p>
-      <w:pPr>
-        <w:rPr>
-          <w:lang w:val="en-US"/>
-        </w:rPr>
-      </w:pPr>
-    </w:p>
-    <w:p>
-      <w:pPr>
-        <w:rPr>
-          <w:lang w:val="en-US"/>
-        </w:rPr>
-      </w:pPr>
-      <w:r>
-        <w:rPr>
-          <w:lang w:val="en-US"/>
-        </w:rPr>
-        <w:t>kubectl get secrets</w:t>
-      </w:r>
-    </w:p>
-    <w:p>
-      <w:pPr>
-        <w:rPr>
-          <w:lang w:val="en-US"/>
-        </w:rPr>
-      </w:pPr>
-      <w:r>
-        <w:rPr>
-          <w:lang w:val="en-US"/>
-        </w:rPr>
-        <w:t>kubectl get PersistentVolumes</w:t>
-      </w:r>
-    </w:p>
-    <w:p>
-      <w:pPr>
-        <w:rPr>
-          <w:lang w:val="en-US"/>
-        </w:rPr>
-      </w:pPr>
-      <w:r>
-        <w:rPr>
-          <w:lang w:val="en-US"/>
-        </w:rPr>
-        <w:t>kubectl get PersistentVolumeClaims</w:t>
-      </w:r>
-    </w:p>
-    <w:p>
-      <w:pPr>
-        <w:rPr>
-          <w:lang w:val="en-US"/>
-        </w:rPr>
-      </w:pPr>
-      <w:r>
-        <w:rPr>
-          <w:lang w:val="en-US"/>
-        </w:rPr>
-        <w:t>kubectl get deployments</w:t>
-      </w:r>
-    </w:p>
-    <w:p>
-      <w:pPr>
-        <w:rPr>
-          <w:lang w:val="en-US"/>
-        </w:rPr>
-      </w:pPr>
-      <w:r>
-        <w:rPr>
-          <w:lang w:val="en-US"/>
-        </w:rPr>
-        <w:t>kubectl get services</w:t>
-      </w:r>
-    </w:p>
-    <w:p>
-      <w:pPr>
-        <w:rPr>
-          <w:lang w:val="en-US"/>
-        </w:rPr>
-      </w:pPr>
-      <w:r>
-        <w:rPr>
-          <w:lang w:val="en-US"/>
-        </w:rPr>
-        <w:t>kubectl get pods</w:t>
-      </w:r>
-    </w:p>
-    <w:p>
-      <w:pPr>
-        <w:rPr>
-          <w:lang w:val="en-US"/>
-        </w:rPr>
-      </w:pPr>
-    </w:p>
-    <w:p>
-      <w:pPr>
-        <w:rPr>
-          <w:lang w:val="en-US"/>
-        </w:rPr>
-      </w:pPr>
-      <w:r>
-        <w:rPr>
-          <w:lang w:val="en-US"/>
-        </w:rPr>
-        <w:t>kubectl exec --stdin --tty mysql-8f5d78b77-5rjrz</w:t>
-      </w:r>
+      <w:proofErr w:type="spellStart"/>
+      <w:r>
+        <w:rPr>
+          <w:lang w:val="en-US"/>
+        </w:rPr>
+        <w:t>kubectl</w:t>
+      </w:r>
+      <w:proofErr w:type="spellEnd"/>
+      <w:r>
+        <w:rPr>
+          <w:lang w:val="en-US"/>
+        </w:rPr>
+        <w:t xml:space="preserve"> apply -f </w:t>
+      </w:r>
+      <w:proofErr w:type="spellStart"/>
+      <w:r>
+        <w:rPr>
+          <w:lang w:val="en-US"/>
+        </w:rPr>
+        <w:t>mysql-</w:t>
+      </w:r>
+      <w:proofErr w:type="gramStart"/>
+      <w:r>
+        <w:rPr>
+          <w:lang w:val="en-US"/>
+        </w:rPr>
+        <w:t>secret.yaml</w:t>
+      </w:r>
+      <w:proofErr w:type="spellEnd"/>
+      <w:proofErr w:type="gramEnd"/>
+    </w:p>
+    <w:p>
+      <w:pPr>
+        <w:rPr>
+          <w:lang w:val="en-US"/>
+        </w:rPr>
+      </w:pPr>
+      <w:proofErr w:type="spellStart"/>
+      <w:r>
+        <w:rPr>
+          <w:lang w:val="en-US"/>
+        </w:rPr>
+        <w:t>kubectl</w:t>
+      </w:r>
+      <w:proofErr w:type="spellEnd"/>
+      <w:r>
+        <w:rPr>
+          <w:lang w:val="en-US"/>
+        </w:rPr>
+        <w:t xml:space="preserve"> apply -f </w:t>
+      </w:r>
+      <w:proofErr w:type="spellStart"/>
+      <w:r>
+        <w:rPr>
+          <w:lang w:val="en-US"/>
+        </w:rPr>
+        <w:t>mysql-</w:t>
+      </w:r>
+      <w:proofErr w:type="gramStart"/>
+      <w:r>
+        <w:rPr>
+          <w:lang w:val="en-US"/>
+        </w:rPr>
+        <w:t>storage.yaml</w:t>
+      </w:r>
+      <w:proofErr w:type="spellEnd"/>
+      <w:proofErr w:type="gramEnd"/>
+    </w:p>
+    <w:p>
+      <w:pPr>
+        <w:rPr>
+          <w:lang w:val="en-US"/>
+        </w:rPr>
+      </w:pPr>
+      <w:proofErr w:type="spellStart"/>
+      <w:r>
+        <w:rPr>
+          <w:lang w:val="en-US"/>
+        </w:rPr>
+        <w:t>kubectl</w:t>
+      </w:r>
+      <w:proofErr w:type="spellEnd"/>
       <w:r>
         <w:rPr>
           <w:lang w:val="en-US"/>
         </w:rPr>
         <w:t xml:space="preserve"> </w:t>
       </w:r>
-      <w:r>
-        <w:rPr>
-          <w:lang w:val="en-US"/>
-        </w:rPr>
-        <w:t>-- mysql -ptest1234</w:t>
-      </w:r>
-    </w:p>
-    <w:p>
-      <w:pPr>
-        <w:rPr>
-          <w:lang w:val="en-US"/>
-        </w:rPr>
-      </w:pPr>
-    </w:p>
-    <w:p>
-      <w:pPr>
-        <w:rPr>
-          <w:lang w:val="en-US"/>
-        </w:rPr>
-      </w:pPr>
-      <w:r>
-        <w:rPr>
+      <w:proofErr w:type="gramStart"/>
+      <w:r>
+        <w:rPr>
+          <w:lang w:val="en-US"/>
+        </w:rPr>
+        <w:t>apply</w:t>
+      </w:r>
+      <w:proofErr w:type="gramEnd"/>
+      <w:r>
+        <w:rPr>
+          <w:lang w:val="en-US"/>
+        </w:rPr>
+        <w:t xml:space="preserve"> -f </w:t>
+      </w:r>
+      <w:proofErr w:type="spellStart"/>
+      <w:r>
+        <w:rPr>
+          <w:lang w:val="en-US"/>
+        </w:rPr>
+        <w:t>mysql-</w:t>
+      </w:r>
+      <w:proofErr w:type="gramStart"/>
+      <w:r>
+        <w:rPr>
+          <w:lang w:val="en-US"/>
+        </w:rPr>
+        <w:t>configmap.yaml</w:t>
+      </w:r>
+      <w:proofErr w:type="spellEnd"/>
+      <w:proofErr w:type="gramEnd"/>
+    </w:p>
+    <w:p>
+      <w:pPr>
+        <w:rPr>
+          <w:lang w:val="en-US"/>
+        </w:rPr>
+      </w:pPr>
+      <w:proofErr w:type="spellStart"/>
+      <w:r>
+        <w:rPr>
+          <w:lang w:val="en-US"/>
+        </w:rPr>
+        <w:t>kubectl</w:t>
+      </w:r>
+      <w:proofErr w:type="spellEnd"/>
+      <w:r>
+        <w:rPr>
+          <w:lang w:val="en-US"/>
+        </w:rPr>
+        <w:t xml:space="preserve"> apply -f </w:t>
+      </w:r>
+      <w:proofErr w:type="spellStart"/>
+      <w:r>
+        <w:rPr>
+          <w:lang w:val="en-US"/>
+        </w:rPr>
+        <w:t>mysql-</w:t>
+      </w:r>
+      <w:proofErr w:type="gramStart"/>
+      <w:r>
+        <w:rPr>
+          <w:lang w:val="en-US"/>
+        </w:rPr>
+        <w:t>deployment.yaml</w:t>
+      </w:r>
+      <w:proofErr w:type="spellEnd"/>
+      <w:proofErr w:type="gramEnd"/>
+    </w:p>
+    <w:p>
+      <w:pPr>
+        <w:rPr>
+          <w:lang w:val="en-US"/>
+        </w:rPr>
+      </w:pPr>
+      <w:proofErr w:type="spellStart"/>
+      <w:r>
+        <w:rPr>
+          <w:lang w:val="en-US"/>
+        </w:rPr>
+        <w:t>kubectl</w:t>
+      </w:r>
+      <w:proofErr w:type="spellEnd"/>
+      <w:r>
+        <w:rPr>
+          <w:lang w:val="en-US"/>
+        </w:rPr>
+        <w:t xml:space="preserve"> </w:t>
+      </w:r>
+      <w:proofErr w:type="gramStart"/>
+      <w:r>
+        <w:rPr>
+          <w:lang w:val="en-US"/>
+        </w:rPr>
+        <w:t>apply</w:t>
+      </w:r>
+      <w:proofErr w:type="gramEnd"/>
+      <w:r>
+        <w:rPr>
+          <w:lang w:val="en-US"/>
+        </w:rPr>
+        <w:t xml:space="preserve"> -f </w:t>
+      </w:r>
+      <w:proofErr w:type="spellStart"/>
+      <w:r>
+        <w:rPr>
+          <w:lang w:val="en-US"/>
+        </w:rPr>
+        <w:t>mysql-serviceNodePort.yaml</w:t>
+      </w:r>
+      <w:proofErr w:type="spellEnd"/>
+    </w:p>
+    <w:p>
+      <w:pPr>
+        <w:rPr>
+          <w:lang w:val="en-US"/>
+        </w:rPr>
+      </w:pPr>
+    </w:p>
+    <w:p>
+      <w:pPr>
+        <w:rPr>
+          <w:lang w:val="en-US"/>
+        </w:rPr>
+      </w:pPr>
+      <w:proofErr w:type="spellStart"/>
+      <w:r>
+        <w:rPr>
+          <w:lang w:val="en-US"/>
+        </w:rPr>
+        <w:t>kubectl</w:t>
+      </w:r>
+      <w:proofErr w:type="spellEnd"/>
+      <w:r>
+        <w:rPr>
+          <w:lang w:val="en-US"/>
+        </w:rPr>
+        <w:t xml:space="preserve"> get secrets</w:t>
+      </w:r>
+    </w:p>
+    <w:p>
+      <w:pPr>
+        <w:rPr>
+          <w:lang w:val="en-US"/>
+        </w:rPr>
+      </w:pPr>
+      <w:proofErr w:type="spellStart"/>
+      <w:r>
+        <w:rPr>
+          <w:lang w:val="en-US"/>
+        </w:rPr>
+        <w:t>kubectl</w:t>
+      </w:r>
+      <w:proofErr w:type="spellEnd"/>
+      <w:r>
+        <w:rPr>
+          <w:lang w:val="en-US"/>
+        </w:rPr>
+        <w:t xml:space="preserve"> get </w:t>
+      </w:r>
+      <w:proofErr w:type="spellStart"/>
+      <w:r>
+        <w:rPr>
+          <w:lang w:val="en-US"/>
+        </w:rPr>
+        <w:t>PersistentVolumes</w:t>
+      </w:r>
+      <w:proofErr w:type="spellEnd"/>
+    </w:p>
+    <w:p>
+      <w:pPr>
+        <w:rPr>
+          <w:lang w:val="en-US"/>
+        </w:rPr>
+      </w:pPr>
+      <w:proofErr w:type="spellStart"/>
+      <w:r>
+        <w:rPr>
+          <w:lang w:val="en-US"/>
+        </w:rPr>
+        <w:t>kubectl</w:t>
+      </w:r>
+      <w:proofErr w:type="spellEnd"/>
+      <w:r>
+        <w:rPr>
+          <w:lang w:val="en-US"/>
+        </w:rPr>
+        <w:t xml:space="preserve"> get </w:t>
+      </w:r>
+      <w:proofErr w:type="spellStart"/>
+      <w:r>
+        <w:rPr>
+          <w:lang w:val="en-US"/>
+        </w:rPr>
+        <w:t>PersistentVolumeClaims</w:t>
+      </w:r>
+      <w:proofErr w:type="spellEnd"/>
+    </w:p>
+    <w:p>
+      <w:pPr>
+        <w:rPr>
+          <w:lang w:val="en-US"/>
+        </w:rPr>
+      </w:pPr>
+      <w:proofErr w:type="spellStart"/>
+      <w:r>
+        <w:rPr>
+          <w:lang w:val="en-US"/>
+        </w:rPr>
+        <w:t>kubectl</w:t>
+      </w:r>
+      <w:proofErr w:type="spellEnd"/>
+      <w:r>
+        <w:rPr>
+          <w:lang w:val="en-US"/>
+        </w:rPr>
+        <w:t xml:space="preserve"> get deployments</w:t>
+      </w:r>
+    </w:p>
+    <w:p>
+      <w:pPr>
+        <w:rPr>
+          <w:lang w:val="en-US"/>
+        </w:rPr>
+      </w:pPr>
+      <w:proofErr w:type="spellStart"/>
+      <w:r>
+        <w:rPr>
+          <w:lang w:val="en-US"/>
+        </w:rPr>
+        <w:t>kubectl</w:t>
+      </w:r>
+      <w:proofErr w:type="spellEnd"/>
+      <w:r>
+        <w:rPr>
+          <w:lang w:val="en-US"/>
+        </w:rPr>
+        <w:t xml:space="preserve"> get services</w:t>
+      </w:r>
+    </w:p>
+    <w:p>
+      <w:pPr>
+        <w:rPr>
+          <w:lang w:val="en-US"/>
+        </w:rPr>
+      </w:pPr>
+      <w:proofErr w:type="spellStart"/>
+      <w:r>
+        <w:rPr>
+          <w:lang w:val="en-US"/>
+        </w:rPr>
+        <w:t>kubectl</w:t>
+      </w:r>
+      <w:proofErr w:type="spellEnd"/>
+      <w:r>
+        <w:rPr>
+          <w:lang w:val="en-US"/>
+        </w:rPr>
+        <w:t xml:space="preserve"> get pods</w:t>
+      </w:r>
+    </w:p>
+    <w:p>
+      <w:pPr>
+        <w:rPr>
+          <w:lang w:val="en-US"/>
+        </w:rPr>
+      </w:pPr>
+    </w:p>
+    <w:p>
+      <w:pPr>
+        <w:rPr>
+          <w:lang w:val="en-US"/>
+        </w:rPr>
+      </w:pPr>
+      <w:proofErr w:type="spellStart"/>
+      <w:r>
+        <w:rPr>
+          <w:lang w:val="en-US"/>
+        </w:rPr>
+        <w:t>kubectl</w:t>
+      </w:r>
+      <w:proofErr w:type="spellEnd"/>
+      <w:r>
+        <w:rPr>
+          <w:lang w:val="en-US"/>
+        </w:rPr>
+        <w:t xml:space="preserve"> exec --stdin --</w:t>
+      </w:r>
+      <w:proofErr w:type="spellStart"/>
+      <w:r>
+        <w:rPr>
+          <w:lang w:val="en-US"/>
+        </w:rPr>
+        <w:t>tty</w:t>
+      </w:r>
+      <w:proofErr w:type="spellEnd"/>
+      <w:r>
+        <w:rPr>
+          <w:lang w:val="en-US"/>
+        </w:rPr>
+        <w:t xml:space="preserve"> mysql-8f5d78b77-5rjrz</w:t>
+      </w:r>
+      <w:r>
+        <w:rPr>
+          <w:lang w:val="en-US"/>
+        </w:rPr>
+        <w:t xml:space="preserve"> </w:t>
+      </w:r>
+      <w:r>
+        <w:rPr>
+          <w:lang w:val="en-US"/>
+        </w:rPr>
+        <w:t xml:space="preserve">-- </w:t>
+      </w:r>
+      <w:proofErr w:type="spellStart"/>
+      <w:r>
+        <w:rPr>
+          <w:lang w:val="en-US"/>
+        </w:rPr>
+        <w:t>mysql</w:t>
+      </w:r>
+      <w:proofErr w:type="spellEnd"/>
+      <w:r>
+        <w:rPr>
+          <w:lang w:val="en-US"/>
+        </w:rPr>
+        <w:t xml:space="preserve"> -ptest1234</w:t>
+      </w:r>
+    </w:p>
+    <w:p>
+      <w:pPr>
+        <w:rPr>
+          <w:lang w:val="en-US"/>
+        </w:rPr>
+      </w:pPr>
+    </w:p>
+    <w:p>
+      <w:pPr>
+        <w:rPr>
+          <w:lang w:val="en-US"/>
+        </w:rPr>
+      </w:pPr>
+      <w:r>
+        <w:rPr>
+          <w:noProof/>
           <w:lang w:val="en-US"/>
         </w:rPr>
         <w:drawing>
@@ -1288,6 +1989,558 @@
           <w:lang w:val="en-US"/>
         </w:rPr>
       </w:pPr>
+      <w:proofErr w:type="spellStart"/>
+      <w:r>
+        <w:rPr>
+          <w:lang w:val="en-US"/>
+        </w:rPr>
+        <w:t>minikube</w:t>
+      </w:r>
+      <w:proofErr w:type="spellEnd"/>
+      <w:r>
+        <w:rPr>
+          <w:lang w:val="en-US"/>
+        </w:rPr>
+        <w:t xml:space="preserve"> </w:t>
+      </w:r>
+      <w:proofErr w:type="gramStart"/>
+      <w:r>
+        <w:rPr>
+          <w:lang w:val="en-US"/>
+        </w:rPr>
+        <w:t>mount .</w:t>
+      </w:r>
+      <w:proofErr w:type="gramEnd"/>
+      <w:r>
+        <w:rPr>
+          <w:lang w:val="en-US"/>
+        </w:rPr>
+        <w:t>:/</w:t>
+      </w:r>
+      <w:proofErr w:type="spellStart"/>
+      <w:r>
+        <w:rPr>
+          <w:lang w:val="en-US"/>
+        </w:rPr>
+        <w:t>mnt</w:t>
+      </w:r>
+      <w:proofErr w:type="spellEnd"/>
+      <w:r>
+        <w:rPr>
+          <w:lang w:val="en-US"/>
+        </w:rPr>
+        <w:t>/data</w:t>
+      </w:r>
+    </w:p>
+    <w:p>
+      <w:pPr>
+        <w:rPr>
+          <w:lang w:val="en-US"/>
+        </w:rPr>
+      </w:pPr>
+    </w:p>
+    <w:p>
+      <w:pPr>
+        <w:rPr>
+          <w:lang w:val="en-US"/>
+        </w:rPr>
+      </w:pPr>
+    </w:p>
+    <w:p>
+      <w:pPr>
+        <w:rPr>
+          <w:lang w:val="en-US"/>
+        </w:rPr>
+      </w:pPr>
+      <w:proofErr w:type="spellStart"/>
+      <w:r>
+        <w:rPr>
+          <w:lang w:val="en-US"/>
+        </w:rPr>
+        <w:t>kubectl</w:t>
+      </w:r>
+      <w:proofErr w:type="spellEnd"/>
+      <w:r>
+        <w:rPr>
+          <w:lang w:val="en-US"/>
+        </w:rPr>
+        <w:t xml:space="preserve"> </w:t>
+      </w:r>
+      <w:proofErr w:type="gramStart"/>
+      <w:r>
+        <w:rPr>
+          <w:lang w:val="en-US"/>
+        </w:rPr>
+        <w:t>apply</w:t>
+      </w:r>
+      <w:proofErr w:type="gramEnd"/>
+      <w:r>
+        <w:rPr>
+          <w:lang w:val="en-US"/>
+        </w:rPr>
+        <w:t xml:space="preserve"> -f </w:t>
+      </w:r>
+      <w:proofErr w:type="spellStart"/>
+      <w:proofErr w:type="gramStart"/>
+      <w:r>
+        <w:rPr>
+          <w:lang w:val="en-US"/>
+        </w:rPr>
+        <w:t>serviceaccount.yaml</w:t>
+      </w:r>
+      <w:proofErr w:type="spellEnd"/>
+      <w:proofErr w:type="gramEnd"/>
+      <w:r>
+        <w:rPr>
+          <w:lang w:val="en-US"/>
+        </w:rPr>
+        <w:t xml:space="preserve"> </w:t>
+      </w:r>
+    </w:p>
+    <w:p>
+      <w:pPr>
+        <w:rPr>
+          <w:lang w:val="en-US"/>
+        </w:rPr>
+      </w:pPr>
+      <w:proofErr w:type="spellStart"/>
+      <w:r>
+        <w:rPr>
+          <w:lang w:val="en-US"/>
+        </w:rPr>
+        <w:t>kubectl</w:t>
+      </w:r>
+      <w:proofErr w:type="spellEnd"/>
+      <w:r>
+        <w:rPr>
+          <w:lang w:val="en-US"/>
+        </w:rPr>
+        <w:t xml:space="preserve"> apply -f </w:t>
+      </w:r>
+      <w:proofErr w:type="spellStart"/>
+      <w:proofErr w:type="gramStart"/>
+      <w:r>
+        <w:rPr>
+          <w:lang w:val="en-US"/>
+        </w:rPr>
+        <w:t>role.yaml</w:t>
+      </w:r>
+      <w:proofErr w:type="spellEnd"/>
+      <w:proofErr w:type="gramEnd"/>
+      <w:r>
+        <w:rPr>
+          <w:lang w:val="en-US"/>
+        </w:rPr>
+        <w:t xml:space="preserve"> </w:t>
+      </w:r>
+    </w:p>
+    <w:p>
+      <w:pPr>
+        <w:rPr>
+          <w:lang w:val="en-US"/>
+        </w:rPr>
+      </w:pPr>
+      <w:proofErr w:type="spellStart"/>
+      <w:r>
+        <w:rPr>
+          <w:lang w:val="en-US"/>
+        </w:rPr>
+        <w:t>kubectl</w:t>
+      </w:r>
+      <w:proofErr w:type="spellEnd"/>
+      <w:r>
+        <w:rPr>
+          <w:lang w:val="en-US"/>
+        </w:rPr>
+        <w:t xml:space="preserve"> apply -f </w:t>
+      </w:r>
+      <w:proofErr w:type="spellStart"/>
+      <w:proofErr w:type="gramStart"/>
+      <w:r>
+        <w:rPr>
+          <w:lang w:val="en-US"/>
+        </w:rPr>
+        <w:t>rolebinding.yaml</w:t>
+      </w:r>
+      <w:proofErr w:type="spellEnd"/>
+      <w:proofErr w:type="gramEnd"/>
+    </w:p>
+    <w:p>
+      <w:pPr>
+        <w:rPr>
+          <w:lang w:val="en-US"/>
+        </w:rPr>
+      </w:pPr>
+    </w:p>
+    <w:p>
+      <w:pPr>
+        <w:rPr>
+          <w:lang w:val="en-US"/>
+        </w:rPr>
+      </w:pPr>
+      <w:proofErr w:type="spellStart"/>
+      <w:r>
+        <w:rPr>
+          <w:lang w:val="en-US"/>
+        </w:rPr>
+        <w:t>kubectl</w:t>
+      </w:r>
+      <w:proofErr w:type="spellEnd"/>
+      <w:r>
+        <w:rPr>
+          <w:lang w:val="en-US"/>
+        </w:rPr>
+        <w:t xml:space="preserve"> get </w:t>
+      </w:r>
+      <w:proofErr w:type="spellStart"/>
+      <w:r>
+        <w:rPr>
+          <w:lang w:val="en-US"/>
+        </w:rPr>
+        <w:t>serviceaccount</w:t>
+      </w:r>
+      <w:proofErr w:type="spellEnd"/>
+      <w:r>
+        <w:rPr>
+          <w:lang w:val="en-US"/>
+        </w:rPr>
+        <w:t xml:space="preserve"> </w:t>
+      </w:r>
+    </w:p>
+    <w:p>
+      <w:pPr>
+        <w:rPr>
+          <w:lang w:val="en-US"/>
+        </w:rPr>
+      </w:pPr>
+      <w:proofErr w:type="spellStart"/>
+      <w:r>
+        <w:rPr>
+          <w:lang w:val="en-US"/>
+        </w:rPr>
+        <w:t>kubectl</w:t>
+      </w:r>
+      <w:proofErr w:type="spellEnd"/>
+      <w:r>
+        <w:rPr>
+          <w:lang w:val="en-US"/>
+        </w:rPr>
+        <w:t xml:space="preserve"> get role </w:t>
+      </w:r>
+    </w:p>
+    <w:p>
+      <w:pPr>
+        <w:rPr>
+          <w:lang w:val="en-US"/>
+        </w:rPr>
+      </w:pPr>
+      <w:proofErr w:type="spellStart"/>
+      <w:r>
+        <w:rPr>
+          <w:lang w:val="en-US"/>
+        </w:rPr>
+        <w:t>kubectl</w:t>
+      </w:r>
+      <w:proofErr w:type="spellEnd"/>
+      <w:r>
+        <w:rPr>
+          <w:lang w:val="en-US"/>
+        </w:rPr>
+        <w:t xml:space="preserve"> get </w:t>
+      </w:r>
+      <w:proofErr w:type="spellStart"/>
+      <w:r>
+        <w:rPr>
+          <w:lang w:val="en-US"/>
+        </w:rPr>
+        <w:t>rolebinding</w:t>
+      </w:r>
+      <w:proofErr w:type="spellEnd"/>
+    </w:p>
+    <w:p>
+      <w:pPr>
+        <w:rPr>
+          <w:lang w:val="en-US"/>
+        </w:rPr>
+      </w:pPr>
+    </w:p>
+    <w:p>
+      <w:pPr>
+        <w:rPr>
+          <w:lang w:val="en-US"/>
+        </w:rPr>
+      </w:pPr>
+      <w:proofErr w:type="spellStart"/>
+      <w:r>
+        <w:rPr>
+          <w:lang w:val="en-US"/>
+        </w:rPr>
+        <w:t>kubectl</w:t>
+      </w:r>
+      <w:proofErr w:type="spellEnd"/>
+      <w:r>
+        <w:rPr>
+          <w:lang w:val="en-US"/>
+        </w:rPr>
+        <w:t xml:space="preserve"> auth can-</w:t>
+      </w:r>
+      <w:proofErr w:type="spellStart"/>
+      <w:r>
+        <w:rPr>
+          <w:lang w:val="en-US"/>
+        </w:rPr>
+        <w:t>i</w:t>
+      </w:r>
+      <w:proofErr w:type="spellEnd"/>
+      <w:r>
+        <w:rPr>
+          <w:lang w:val="en-US"/>
+        </w:rPr>
+        <w:t xml:space="preserve"> get pods --as=</w:t>
+      </w:r>
+      <w:proofErr w:type="spellStart"/>
+      <w:proofErr w:type="gramStart"/>
+      <w:r>
+        <w:rPr>
+          <w:lang w:val="en-US"/>
+        </w:rPr>
+        <w:t>system:serviceaccount</w:t>
+      </w:r>
+      <w:proofErr w:type="gramEnd"/>
+      <w:r>
+        <w:rPr>
+          <w:lang w:val="en-US"/>
+        </w:rPr>
+        <w:t>:</w:t>
+      </w:r>
+      <w:proofErr w:type="gramStart"/>
+      <w:r>
+        <w:rPr>
+          <w:lang w:val="en-US"/>
+        </w:rPr>
+        <w:t>default:heart</w:t>
+      </w:r>
+      <w:proofErr w:type="gramEnd"/>
+      <w:r>
+        <w:rPr>
+          <w:lang w:val="en-US"/>
+        </w:rPr>
+        <w:t>-user</w:t>
+      </w:r>
+      <w:proofErr w:type="spellEnd"/>
+      <w:r>
+        <w:rPr>
+          <w:lang w:val="en-US"/>
+        </w:rPr>
+        <w:t xml:space="preserve"> </w:t>
+      </w:r>
+    </w:p>
+    <w:p>
+      <w:pPr>
+        <w:rPr>
+          <w:lang w:val="en-US"/>
+        </w:rPr>
+      </w:pPr>
+      <w:proofErr w:type="spellStart"/>
+      <w:r>
+        <w:rPr>
+          <w:lang w:val="en-US"/>
+        </w:rPr>
+        <w:t>kubectl</w:t>
+      </w:r>
+      <w:proofErr w:type="spellEnd"/>
+      <w:r>
+        <w:rPr>
+          <w:lang w:val="en-US"/>
+        </w:rPr>
+        <w:t xml:space="preserve"> auth can-</w:t>
+      </w:r>
+      <w:proofErr w:type="spellStart"/>
+      <w:r>
+        <w:rPr>
+          <w:lang w:val="en-US"/>
+        </w:rPr>
+        <w:t>i</w:t>
+      </w:r>
+      <w:proofErr w:type="spellEnd"/>
+      <w:r>
+        <w:rPr>
+          <w:lang w:val="en-US"/>
+        </w:rPr>
+        <w:t xml:space="preserve"> list services --as=</w:t>
+      </w:r>
+      <w:proofErr w:type="spellStart"/>
+      <w:proofErr w:type="gramStart"/>
+      <w:r>
+        <w:rPr>
+          <w:lang w:val="en-US"/>
+        </w:rPr>
+        <w:t>system:serviceaccount</w:t>
+      </w:r>
+      <w:proofErr w:type="gramEnd"/>
+      <w:r>
+        <w:rPr>
+          <w:lang w:val="en-US"/>
+        </w:rPr>
+        <w:t>:</w:t>
+      </w:r>
+      <w:proofErr w:type="gramStart"/>
+      <w:r>
+        <w:rPr>
+          <w:lang w:val="en-US"/>
+        </w:rPr>
+        <w:t>default:heart</w:t>
+      </w:r>
+      <w:proofErr w:type="gramEnd"/>
+      <w:r>
+        <w:rPr>
+          <w:lang w:val="en-US"/>
+        </w:rPr>
+        <w:t>-user</w:t>
+      </w:r>
+      <w:proofErr w:type="spellEnd"/>
+      <w:r>
+        <w:rPr>
+          <w:lang w:val="en-US"/>
+        </w:rPr>
+        <w:t xml:space="preserve"> </w:t>
+      </w:r>
+    </w:p>
+    <w:p>
+      <w:pPr>
+        <w:rPr>
+          <w:lang w:val="en-US"/>
+        </w:rPr>
+      </w:pPr>
+      <w:proofErr w:type="spellStart"/>
+      <w:r>
+        <w:rPr>
+          <w:lang w:val="en-US"/>
+        </w:rPr>
+        <w:t>kubectl</w:t>
+      </w:r>
+      <w:proofErr w:type="spellEnd"/>
+      <w:r>
+        <w:rPr>
+          <w:lang w:val="en-US"/>
+        </w:rPr>
+        <w:t xml:space="preserve"> auth can-</w:t>
+      </w:r>
+      <w:proofErr w:type="spellStart"/>
+      <w:r>
+        <w:rPr>
+          <w:lang w:val="en-US"/>
+        </w:rPr>
+        <w:t>i</w:t>
+      </w:r>
+      <w:proofErr w:type="spellEnd"/>
+      <w:r>
+        <w:rPr>
+          <w:lang w:val="en-US"/>
+        </w:rPr>
+        <w:t xml:space="preserve"> delete pods --as=</w:t>
+      </w:r>
+      <w:proofErr w:type="spellStart"/>
+      <w:proofErr w:type="gramStart"/>
+      <w:r>
+        <w:rPr>
+          <w:lang w:val="en-US"/>
+        </w:rPr>
+        <w:t>system:serviceaccount</w:t>
+      </w:r>
+      <w:proofErr w:type="gramEnd"/>
+      <w:r>
+        <w:rPr>
+          <w:lang w:val="en-US"/>
+        </w:rPr>
+        <w:t>:</w:t>
+      </w:r>
+      <w:proofErr w:type="gramStart"/>
+      <w:r>
+        <w:rPr>
+          <w:lang w:val="en-US"/>
+        </w:rPr>
+        <w:t>default:heart</w:t>
+      </w:r>
+      <w:proofErr w:type="gramEnd"/>
+      <w:r>
+        <w:rPr>
+          <w:lang w:val="en-US"/>
+        </w:rPr>
+        <w:t>-user</w:t>
+      </w:r>
+      <w:proofErr w:type="spellEnd"/>
+      <w:r>
+        <w:rPr>
+          <w:lang w:val="en-US"/>
+        </w:rPr>
+        <w:t xml:space="preserve"> </w:t>
+      </w:r>
+    </w:p>
+    <w:p>
+      <w:pPr>
+        <w:rPr>
+          <w:lang w:val="en-US"/>
+        </w:rPr>
+      </w:pPr>
+      <w:proofErr w:type="spellStart"/>
+      <w:r>
+        <w:rPr>
+          <w:lang w:val="en-US"/>
+        </w:rPr>
+        <w:t>kubectl</w:t>
+      </w:r>
+      <w:proofErr w:type="spellEnd"/>
+      <w:r>
+        <w:rPr>
+          <w:lang w:val="en-US"/>
+        </w:rPr>
+        <w:t xml:space="preserve"> auth can-</w:t>
+      </w:r>
+      <w:proofErr w:type="spellStart"/>
+      <w:r>
+        <w:rPr>
+          <w:lang w:val="en-US"/>
+        </w:rPr>
+        <w:t>i</w:t>
+      </w:r>
+      <w:proofErr w:type="spellEnd"/>
+      <w:r>
+        <w:rPr>
+          <w:lang w:val="en-US"/>
+        </w:rPr>
+        <w:t xml:space="preserve"> create deployments --as=</w:t>
+      </w:r>
+      <w:proofErr w:type="spellStart"/>
+      <w:proofErr w:type="gramStart"/>
+      <w:r>
+        <w:rPr>
+          <w:lang w:val="en-US"/>
+        </w:rPr>
+        <w:t>system:serviceaccount</w:t>
+      </w:r>
+      <w:proofErr w:type="gramEnd"/>
+      <w:r>
+        <w:rPr>
+          <w:lang w:val="en-US"/>
+        </w:rPr>
+        <w:t>:</w:t>
+      </w:r>
+      <w:proofErr w:type="gramStart"/>
+      <w:r>
+        <w:rPr>
+          <w:lang w:val="en-US"/>
+        </w:rPr>
+        <w:t>default:heart</w:t>
+      </w:r>
+      <w:proofErr w:type="gramEnd"/>
+      <w:r>
+        <w:rPr>
+          <w:lang w:val="en-US"/>
+        </w:rPr>
+        <w:t>-user</w:t>
+      </w:r>
+      <w:proofErr w:type="spellEnd"/>
     </w:p>
     <w:p>
       <w:pPr>
@@ -1938,7 +3191,6 @@
   <w:style w:type="character" w:default="1" w:styleId="Policepardfaut">
     <w:name w:val="Default Paragraph Font"/>
     <w:uiPriority w:val="1"/>
-    <w:semiHidden/>
     <w:unhideWhenUsed/>
   </w:style>
   <w:style w:type="table" w:default="1" w:styleId="TableauNormal">

</xml_diff>